<commit_message>
docs: SmartFarmAgent 方案 v2.0 整体重写（ESP32 单芯片 + Node.js/Vue 技术栈）
</commit_message>
<xml_diff>
--- a/PROPOSAL.docx
+++ b/PROPOSAL.docx
@@ -116,7 +116,7 @@
           <w:sz w:val="24"/>
           <w:szCs w:val="24"/>
         </w:rPr>
-        <w:t xml:space="preserve">机会：2025—2026 年竞赛集中在「智能体 / IoT + 大模型」方向；司农、稷丰等农业开源大模型与 RAGFlow、Dify 等 RAG 框架已成熟可用，硬件成本低，整条链路可以自研。</w:t>
+        <w:t xml:space="preserve">机会：2025—2026 年竞赛集中在「智能体 / IoT + 大模型」方向；司农、稷丰等农业开源大模型与 RAGFlow、Dify 等 RAG 框架已成熟可用；ESP32 单芯片即可完成数据采集、拍照与控制，Node.js + Vue 全栈平台生态成熟，硬件与软件成本都低，整条链路可以自研。</w:t>
       </w:r>
     </w:p>
     <w:p>
@@ -364,7 +364,7 @@
                 <w:sz w:val="21"/>
                 <w:szCs w:val="21"/>
               </w:rPr>
-              <w:t xml:space="preserve">微信小程序 / H5 大屏 / LabVIEW 上位机</w:t>
+              <w:t xml:space="preserve">Vue 3 Web 大屏 / H5：实时曲线、设备控制、农技问答、视觉告警</w:t>
             </w:r>
           </w:p>
         </w:tc>
@@ -391,7 +391,7 @@
                 <w:sz w:val="21"/>
                 <w:szCs w:val="21"/>
               </w:rPr>
-              <w:t xml:space="preserve">前端、上位机</w:t>
+              <w:t xml:space="preserve">Vue、ECharts、WebSocket</w:t>
             </w:r>
           </w:p>
         </w:tc>
@@ -590,7 +590,7 @@
                 <w:sz w:val="21"/>
                 <w:szCs w:val="21"/>
               </w:rPr>
-              <w:t xml:space="preserve">MQTT Broker（EMQX/OneNET）→ 时序存储 → Node-RED 可视化</w:t>
+              <w:t xml:space="preserve">Node.js 后端：MQTT 接入（mqtt.js）→ 时序存储 → REST/WebSocket API；智能体编排</w:t>
             </w:r>
           </w:p>
         </w:tc>
@@ -617,7 +617,7 @@
                 <w:sz w:val="21"/>
                 <w:szCs w:val="21"/>
               </w:rPr>
-              <w:t xml:space="preserve">MQTT、时序存储</w:t>
+              <w:t xml:space="preserve">Node.js、MQTT、时序存储</w:t>
             </w:r>
           </w:p>
         </w:tc>
@@ -703,7 +703,7 @@
                 <w:sz w:val="21"/>
                 <w:szCs w:val="21"/>
               </w:rPr>
-              <w:t xml:space="preserve">ESP32-CAM 拍照/轻量推理；断网规则兜底（本地优先）</w:t>
+              <w:t xml:space="preserve">ESP32-CAM 定时拍照上传；断网规则兜底（本地优先）</w:t>
             </w:r>
           </w:p>
         </w:tc>
@@ -730,7 +730,7 @@
                 <w:sz w:val="21"/>
                 <w:szCs w:val="21"/>
               </w:rPr>
-              <w:t xml:space="preserve">边缘计算、轻量推理</w:t>
+              <w:t xml:space="preserve">边缘计算、定时任务</w:t>
             </w:r>
           </w:p>
         </w:tc>
@@ -816,7 +816,7 @@
                 <w:sz w:val="21"/>
                 <w:szCs w:val="21"/>
               </w:rPr>
-              <w:t xml:space="preserve">USART 文本帧协议 + ESP8266 MQTT</w:t>
+              <w:t xml:space="preserve">ESP32 内置 Wi-Fi：MQTT（JSON 上行/下行）+ HTTP 图片上传</w:t>
             </w:r>
           </w:p>
         </w:tc>
@@ -843,7 +843,7 @@
                 <w:sz w:val="21"/>
                 <w:szCs w:val="21"/>
               </w:rPr>
-              <w:t xml:space="preserve">串口、MQTT</w:t>
+              <w:t xml:space="preserve">Wi-Fi、MQTT</w:t>
             </w:r>
           </w:p>
         </w:tc>
@@ -929,7 +929,7 @@
                 <w:sz w:val="21"/>
                 <w:szCs w:val="21"/>
               </w:rPr>
-              <w:t xml:space="preserve">STM32F103C8T6 + 传感器 + 继电器/泵/灯/喷药</w:t>
+              <w:t xml:space="preserve">ESP32 单芯片：传感器采集 + 继电器/泵/灯/喷药 + OLED + microSD 日志</w:t>
             </w:r>
           </w:p>
         </w:tc>
@@ -956,7 +956,7 @@
                 <w:sz w:val="21"/>
                 <w:szCs w:val="21"/>
               </w:rPr>
-              <w:t xml:space="preserve">GPIO、ADC、I2C、SPI</w:t>
+              <w:t xml:space="preserve">GPIO、ADC、I2C、PWM</w:t>
             </w:r>
           </w:p>
         </w:tc>
@@ -1357,7 +1357,7 @@
                 <w:sz w:val="21"/>
                 <w:szCs w:val="21"/>
               </w:rPr>
-              <w:t xml:space="preserve">已有土壤传感器+继电器；开源整机项目已验证</w:t>
+              <w:t xml:space="preserve">已有土壤传感器+继电器；ESP32 整机案例已验证</w:t>
             </w:r>
           </w:p>
         </w:tc>
@@ -1384,7 +1384,7 @@
                 <w:sz w:val="21"/>
                 <w:szCs w:val="21"/>
               </w:rPr>
-              <w:t xml:space="preserve">GPIO、ADC、串口协议</w:t>
+              <w:t xml:space="preserve">GPIO、ADC、MQTT</w:t>
             </w:r>
           </w:p>
         </w:tc>
@@ -1524,7 +1524,7 @@
                 <w:sz w:val="21"/>
                 <w:szCs w:val="21"/>
               </w:rPr>
-              <w:t xml:space="preserve">传感器已有；PWM/PID 为已学或进行中内容</w:t>
+              <w:t xml:space="preserve">传感器已有；PWM 知识可迁移到 ESP32</w:t>
             </w:r>
           </w:p>
         </w:tc>
@@ -1637,7 +1637,7 @@
                 <w:sz w:val="21"/>
                 <w:szCs w:val="21"/>
               </w:rPr>
-              <w:t xml:space="preserve">摄像头定拍 → YOLOv8（先云后边）→ 置信度达标 → 喷药泵</w:t>
+              <w:t xml:space="preserve">ESP32-CAM 定时拍照上传 → YOLOv8（先云后边）→ 置信度达标 → 喷药泵</w:t>
             </w:r>
           </w:p>
         </w:tc>
@@ -1691,7 +1691,7 @@
                 <w:sz w:val="21"/>
                 <w:szCs w:val="21"/>
               </w:rPr>
-              <w:t xml:space="preserve">PlantDoc/PlantVillage 公开数据集 + 多个 ESP32-CAM/YOLO 先例</w:t>
+              <w:t xml:space="preserve">PlantDoc/PlantVillage 公开数据集 + ESP32-CAM/YOLO 全链路先例</w:t>
             </w:r>
           </w:p>
         </w:tc>
@@ -1718,7 +1718,7 @@
                 <w:sz w:val="21"/>
                 <w:szCs w:val="21"/>
               </w:rPr>
-              <w:t xml:space="preserve">Python、YOLO、视觉</w:t>
+              <w:t xml:space="preserve">YOLO、HTTP 上传</w:t>
             </w:r>
           </w:p>
         </w:tc>
@@ -1944,7 +1944,7 @@
                 <w:sz w:val="21"/>
                 <w:szCs w:val="21"/>
               </w:rPr>
-              <w:t xml:space="preserve">智能体决策</w:t>
+              <w:t xml:space="preserve">农技知识问答</w:t>
             </w:r>
           </w:p>
         </w:tc>
@@ -1971,7 +1971,7 @@
                 <w:sz w:val="21"/>
                 <w:szCs w:val="21"/>
               </w:rPr>
-              <w:t xml:space="preserve">传感器+检测+历史 → 大模型（司农/DeepSeek）→ 设备指令+解释</w:t>
+              <w:t xml:space="preserve">种植/病虫害/用药知识库 → RAG 检索增强 → 结构化方案+来源标注</w:t>
             </w:r>
           </w:p>
         </w:tc>
@@ -1998,7 +1998,7 @@
                 <w:sz w:val="21"/>
                 <w:szCs w:val="21"/>
               </w:rPr>
-              <w:t xml:space="preserve">高</w:t>
+              <w:t xml:space="preserve">中</w:t>
             </w:r>
           </w:p>
         </w:tc>
@@ -2025,7 +2025,7 @@
                 <w:sz w:val="21"/>
                 <w:szCs w:val="21"/>
               </w:rPr>
-              <w:t xml:space="preserve">Dify 官方 HTTP 节点可调外部 API；农业大模型已开源</w:t>
+              <w:t xml:space="preserve">司农/DeepSeek + RAGFlow 已核验，Node.js 可调其 HTTP API</w:t>
             </w:r>
           </w:p>
         </w:tc>
@@ -2052,7 +2052,7 @@
                 <w:sz w:val="21"/>
                 <w:szCs w:val="21"/>
               </w:rPr>
-              <w:t xml:space="preserve">RAG、Agent</w:t>
+              <w:t xml:space="preserve">RAG、Node.js</w:t>
             </w:r>
           </w:p>
         </w:tc>
@@ -2111,6 +2111,173 @@
                 <w:sz w:val="21"/>
                 <w:szCs w:val="21"/>
               </w:rPr>
+              <w:t xml:space="preserve">智能体决策</w:t>
+            </w:r>
+          </w:p>
+        </w:tc>
+        <w:tc>
+          <w:tcPr>
+            <w:tcW w:type="dxa" w:w="2750"/>
+            <w:tcMar>
+              <w:top w:type="dxa" w:w="40"/>
+              <w:left w:type="dxa" w:w="80"/>
+              <w:bottom w:type="dxa" w:w="40"/>
+              <w:right w:type="dxa" w:w="80"/>
+            </w:tcMar>
+            <w:vAlign w:val="center"/>
+          </w:tcPr>
+          <w:p>
+            <w:pPr>
+              <w:spacing w:after="0" w:line="240"/>
+              <w:jc w:val="left"/>
+            </w:pPr>
+            <w:r>
+              <w:rPr>
+                <w:rFonts w:ascii="Times New Roman" w:cs="Times New Roman" w:eastAsia="SimSun" w:hAnsi="Times New Roman"/>
+                <w:color w:val="000000"/>
+                <w:sz w:val="21"/>
+                <w:szCs w:val="21"/>
+              </w:rPr>
+              <w:t xml:space="preserve">Node.js 编排：传感器+视觉+历史 → 大模型（司农/DeepSeek）→ JSON 指令+解释</w:t>
+            </w:r>
+          </w:p>
+        </w:tc>
+        <w:tc>
+          <w:tcPr>
+            <w:tcW w:type="dxa" w:w="620"/>
+            <w:tcMar>
+              <w:top w:type="dxa" w:w="40"/>
+              <w:left w:type="dxa" w:w="80"/>
+              <w:bottom w:type="dxa" w:w="40"/>
+              <w:right w:type="dxa" w:w="80"/>
+            </w:tcMar>
+            <w:vAlign w:val="center"/>
+          </w:tcPr>
+          <w:p>
+            <w:pPr>
+              <w:spacing w:after="0" w:line="240"/>
+              <w:jc w:val="center"/>
+            </w:pPr>
+            <w:r>
+              <w:rPr>
+                <w:rFonts w:ascii="Times New Roman" w:cs="Times New Roman" w:eastAsia="SimSun" w:hAnsi="Times New Roman"/>
+                <w:color w:val="000000"/>
+                <w:sz w:val="21"/>
+                <w:szCs w:val="21"/>
+              </w:rPr>
+              <w:t xml:space="preserve">高</w:t>
+            </w:r>
+          </w:p>
+        </w:tc>
+        <w:tc>
+          <w:tcPr>
+            <w:tcW w:type="dxa" w:w="2652"/>
+            <w:tcMar>
+              <w:top w:type="dxa" w:w="40"/>
+              <w:left w:type="dxa" w:w="80"/>
+              <w:bottom w:type="dxa" w:w="40"/>
+              <w:right w:type="dxa" w:w="80"/>
+            </w:tcMar>
+            <w:vAlign w:val="center"/>
+          </w:tcPr>
+          <w:p>
+            <w:pPr>
+              <w:spacing w:after="0" w:line="240"/>
+              <w:jc w:val="left"/>
+            </w:pPr>
+            <w:r>
+              <w:rPr>
+                <w:rFonts w:ascii="Times New Roman" w:cs="Times New Roman" w:eastAsia="SimSun" w:hAnsi="Times New Roman"/>
+                <w:color w:val="000000"/>
+                <w:sz w:val="21"/>
+                <w:szCs w:val="21"/>
+              </w:rPr>
+              <w:t xml:space="preserve">LLM 兼容 API + MQTT 下行链路已验证</w:t>
+            </w:r>
+          </w:p>
+        </w:tc>
+        <w:tc>
+          <w:tcPr>
+            <w:tcW w:type="dxa" w:w="1500"/>
+            <w:tcMar>
+              <w:top w:type="dxa" w:w="40"/>
+              <w:left w:type="dxa" w:w="80"/>
+              <w:bottom w:type="dxa" w:w="40"/>
+              <w:right w:type="dxa" w:w="80"/>
+            </w:tcMar>
+            <w:vAlign w:val="center"/>
+          </w:tcPr>
+          <w:p>
+            <w:pPr>
+              <w:spacing w:after="0" w:line="240"/>
+              <w:jc w:val="center"/>
+            </w:pPr>
+            <w:r>
+              <w:rPr>
+                <w:rFonts w:ascii="Times New Roman" w:cs="Times New Roman" w:eastAsia="SimSun" w:hAnsi="Times New Roman"/>
+                <w:color w:val="000000"/>
+                <w:sz w:val="21"/>
+                <w:szCs w:val="21"/>
+              </w:rPr>
+              <w:t xml:space="preserve">Agent、MQTT</w:t>
+            </w:r>
+          </w:p>
+        </w:tc>
+      </w:tr>
+      <w:tr>
+        <w:trPr>
+          <w:tblHeader w:val="false"/>
+        </w:trPr>
+        <w:tc>
+          <w:tcPr>
+            <w:tcW w:type="dxa" w:w="450"/>
+            <w:tcMar>
+              <w:top w:type="dxa" w:w="40"/>
+              <w:left w:type="dxa" w:w="80"/>
+              <w:bottom w:type="dxa" w:w="40"/>
+              <w:right w:type="dxa" w:w="80"/>
+            </w:tcMar>
+            <w:vAlign w:val="center"/>
+          </w:tcPr>
+          <w:p>
+            <w:pPr>
+              <w:spacing w:after="0" w:line="240"/>
+              <w:jc w:val="center"/>
+            </w:pPr>
+            <w:r>
+              <w:rPr>
+                <w:rFonts w:ascii="Times New Roman" w:cs="Times New Roman" w:eastAsia="SimSun" w:hAnsi="Times New Roman"/>
+                <w:color w:val="000000"/>
+                <w:sz w:val="21"/>
+                <w:szCs w:val="21"/>
+              </w:rPr>
+              <w:t xml:space="preserve">7</w:t>
+            </w:r>
+          </w:p>
+        </w:tc>
+        <w:tc>
+          <w:tcPr>
+            <w:tcW w:type="dxa" w:w="1100"/>
+            <w:tcMar>
+              <w:top w:type="dxa" w:w="40"/>
+              <w:left w:type="dxa" w:w="80"/>
+              <w:bottom w:type="dxa" w:w="40"/>
+              <w:right w:type="dxa" w:w="80"/>
+            </w:tcMar>
+            <w:vAlign w:val="center"/>
+          </w:tcPr>
+          <w:p>
+            <w:pPr>
+              <w:spacing w:after="0" w:line="240"/>
+              <w:jc w:val="center"/>
+            </w:pPr>
+            <w:r>
+              <w:rPr>
+                <w:rFonts w:ascii="Times New Roman" w:cs="Times New Roman" w:eastAsia="SimSun" w:hAnsi="Times New Roman"/>
+                <w:color w:val="000000"/>
+                <w:sz w:val="21"/>
+                <w:szCs w:val="21"/>
+              </w:rPr>
               <w:t xml:space="preserve">数据中台/展示</w:t>
             </w:r>
           </w:p>
@@ -2138,7 +2305,7 @@
                 <w:sz w:val="21"/>
                 <w:szCs w:val="21"/>
               </w:rPr>
-              <w:t xml:space="preserve">MQTT 上行 → 时序存储 → 小程序/H5；W25Q64 本地日志</w:t>
+              <w:t xml:space="preserve">MQTT 上行 → Node.js 时序存储 → Vue 大屏；ESP32 microSD 断网日志</w:t>
             </w:r>
           </w:p>
         </w:tc>
@@ -2192,7 +2359,7 @@
                 <w:sz w:val="21"/>
                 <w:szCs w:val="21"/>
               </w:rPr>
-              <w:t xml:space="preserve">EMQX/Node-RED 成熟；农业岛平台可二开</w:t>
+              <w:t xml:space="preserve">Express/mqtt.js/ECharts 成熟；EMQX 已核验</w:t>
             </w:r>
           </w:p>
         </w:tc>
@@ -2219,7 +2386,7 @@
                 <w:sz w:val="21"/>
                 <w:szCs w:val="21"/>
               </w:rPr>
-              <w:t xml:space="preserve">SPI、云平台</w:t>
+              <w:t xml:space="preserve">Node.js、Vue</w:t>
             </w:r>
           </w:p>
         </w:tc>
@@ -2411,7 +2578,7 @@
                 <w:sz w:val="21"/>
                 <w:szCs w:val="21"/>
               </w:rPr>
-              <w:t xml:space="preserve">BH1750/DHT11/土壤 → STM32 采集打包（文本帧）；ESP32-CAM 拍照上传（HTTP/MQTT）</w:t>
+              <w:t xml:space="preserve">BH1750/DHT11/土壤 → ESP32 采集打包（JSON）；ESP32-CAM 定时拍照</w:t>
             </w:r>
           </w:p>
         </w:tc>
@@ -2438,7 +2605,7 @@
                 <w:sz w:val="21"/>
                 <w:szCs w:val="21"/>
               </w:rPr>
-              <w:t xml:space="preserve">数据帧 / 图片</w:t>
+              <w:t xml:space="preserve">数据 / 图片</w:t>
             </w:r>
           </w:p>
         </w:tc>
@@ -2497,7 +2664,7 @@
                 <w:sz w:val="21"/>
                 <w:szCs w:val="21"/>
               </w:rPr>
-              <w:t xml:space="preserve">USART 帧 + ESP8266 MQTT；本地接 LabVIEW 调试 + W25Q64 日志</w:t>
+              <w:t xml:space="preserve">ESP32 Wi-Fi：MQTT 上行情报 + HTTP 图片上传；断网时 microSD 本地日志</w:t>
             </w:r>
           </w:p>
         </w:tc>
@@ -2524,7 +2691,7 @@
                 <w:sz w:val="21"/>
                 <w:szCs w:val="21"/>
               </w:rPr>
-              <w:t xml:space="preserve">上行数据</w:t>
+              <w:t xml:space="preserve">上行数据 / 图片</w:t>
             </w:r>
           </w:p>
         </w:tc>
@@ -2583,7 +2750,7 @@
                 <w:sz w:val="21"/>
                 <w:szCs w:val="21"/>
               </w:rPr>
-              <w:t xml:space="preserve">MQTT Broker（EMQX/OneNET）→ 时序存储 + Node-RED 可视化</w:t>
+              <w:t xml:space="preserve">Node.js 后端（mqtt.js）订阅 → 时序存储 → REST/WebSocket API</w:t>
             </w:r>
           </w:p>
         </w:tc>
@@ -2755,7 +2922,7 @@
                 <w:sz w:val="21"/>
                 <w:szCs w:val="21"/>
               </w:rPr>
-              <w:t xml:space="preserve">MQTT 下行指令 → 网关转 HTTP/串口 → STM32 解析 → 继电器/泵/灯/喷药</w:t>
+              <w:t xml:space="preserve">MQTT 下行指令 → ESP32 解析（白名单）→ 继电器/泵/灯/喷药</w:t>
             </w:r>
           </w:p>
         </w:tc>
@@ -2841,7 +3008,7 @@
                 <w:sz w:val="21"/>
                 <w:szCs w:val="21"/>
               </w:rPr>
-              <w:t xml:space="preserve">执行状态回传 → 数据入库 → 小程序/大屏展示 + 智能体下次决策依据</w:t>
+              <w:t xml:space="preserve">执行状态回传 → 数据入库 → Vue 大屏展示 + 智能体下次决策依据</w:t>
             </w:r>
           </w:p>
         </w:tc>
@@ -2919,7 +3086,7 @@
           <w:sz w:val="24"/>
           <w:szCs w:val="24"/>
         </w:rPr>
-        <w:t xml:space="preserve">全部器件为 STM32 生态常用模块，与现有学习内容一一对应；参考整机项目（stm32-flower-greenhouse、smart-orchard-irrigation-system 等）已跑通相同硬件组合。</w:t>
+        <w:t xml:space="preserve">ESP32 生态成熟（arduino-esp32 官方核心，17k+ 星，持续更新）；ESP32-CAM 单板集成摄像头、Wi-Fi 与 microSD，外接传感器/继电器的整机案例丰富；现有 I2C、SPI、串口、PWM 知识可直接迁移。</w:t>
       </w:r>
     </w:p>
     <w:p>
@@ -2943,7 +3110,7 @@
         </w:rPr>
         <w:t xml:space="preserve">视觉检测链路：</w:t>
       </w:r>
-      <w:hyperlink w:history="1" r:id="rIdkkq4-tmqqjutwmqe7qrsf">
+      <w:hyperlink w:history="1" r:id="rId8tn9rh776mkoy0mhplrjb">
         <w:r>
           <w:rPr>
             <w:rFonts w:ascii="Times New Roman" w:cs="Times New Roman" w:eastAsia="SimSun" w:hAnsi="Times New Roman"/>
@@ -2962,7 +3129,7 @@
           <w:sz w:val="24"/>
           <w:szCs w:val="24"/>
         </w:rPr>
-        <w:t xml:space="preserve"> 数据集有官方 GitHub 仓库（427 星，CODS-COMAD 2020 论文配套）；PlantVillage 数据集在 Kaggle 公开（5 万+ 图、38 类）；YOLOv8 框架成熟（Ultralytics 60k 星），已有温室作物病害检测、ESP32-CAM 实时检测先例。</w:t>
+        <w:t xml:space="preserve"> 数据集有官方 GitHub 仓库（427 星，CODS-COMAD 2020 论文配套）；PlantVillage 数据集在 Kaggle 公开（5 万+ 图、38 类）；YOLOv8 框架成熟（Ultralytics 60k 星），已有温室作物病害检测、ESP32-CAM 实时检测全链路先例。</w:t>
       </w:r>
     </w:p>
     <w:p>
@@ -2993,9 +3160,9 @@
           <w:sz w:val="24"/>
           <w:szCs w:val="24"/>
         </w:rPr>
-        <w:t xml:space="preserve">司农（南京农业大学，国内首个农业开源大语言模型，8B/32B，魔搭+GitHub 开源）与稷丰 </w:t>
-      </w:r>
-      <w:hyperlink w:history="1" r:id="rIdj00jtw4e6qrvvbfvtyzha">
+        <w:t xml:space="preserve">司农（南京农业大学，国内首个农业开源大语言模型，8B/32B）与稷丰 </w:t>
+      </w:r>
+      <w:hyperlink w:history="1" r:id="rIdzpto9_vfncpmom4cjxw78">
         <w:r>
           <w:rPr>
             <w:rFonts w:ascii="Times New Roman" w:cs="Times New Roman" w:eastAsia="SimSun" w:hAnsi="Times New Roman"/>
@@ -3014,7 +3181,7 @@
           <w:sz w:val="24"/>
           <w:szCs w:val="24"/>
         </w:rPr>
-        <w:t xml:space="preserve">（125 星，中文农业多模态）均已核验；Dify 官方文档确认 HTTP Request 节点可调用外部 API，因此「智能体 → HTTP → MQTT 网关 → 设备」路径可行。</w:t>
+        <w:t xml:space="preserve">（125 星，中文农业多模态）均已核验；RAGFlow/Dify 提供 HTTP API，Node.js 后端可直接调用，因此「智能体 → HTTP → MQTT → 设备」路径可行。</w:t>
       </w:r>
     </w:p>
     <w:p>
@@ -3036,9 +3203,93 @@
           <w:sz w:val="24"/>
           <w:szCs w:val="24"/>
         </w:rPr>
-        <w:t xml:space="preserve">云平台链路：</w:t>
-      </w:r>
-      <w:hyperlink w:history="1" r:id="rIdny5tdtprkpuhtkgo7abvz">
+        <w:t xml:space="preserve">平台链路：</w:t>
+      </w:r>
+      <w:hyperlink w:history="1" r:id="rIdmha0ujthsap-oogsr5gfr">
+        <w:r>
+          <w:rPr>
+            <w:rFonts w:ascii="Times New Roman" w:cs="Times New Roman" w:eastAsia="SimSun" w:hAnsi="Times New Roman"/>
+            <w:color w:val="0563C1"/>
+            <w:sz w:val="24"/>
+            <w:szCs w:val="24"/>
+            <w:u w:val="single"/>
+          </w:rPr>
+          <w:t xml:space="preserve">Express</w:t>
+        </w:r>
+      </w:hyperlink>
+      <w:r>
+        <w:rPr>
+          <w:rFonts w:ascii="Times New Roman" w:cs="Times New Roman" w:eastAsia="SimSun" w:hAnsi="Times New Roman"/>
+          <w:color w:val="000000"/>
+          <w:sz w:val="24"/>
+          <w:szCs w:val="24"/>
+        </w:rPr>
+        <w:t xml:space="preserve">（69k 星）、</w:t>
+      </w:r>
+      <w:hyperlink w:history="1" r:id="rIdihizes5y27dubytpvb8as">
+        <w:r>
+          <w:rPr>
+            <w:rFonts w:ascii="Times New Roman" w:cs="Times New Roman" w:eastAsia="SimSun" w:hAnsi="Times New Roman"/>
+            <w:color w:val="0563C1"/>
+            <w:sz w:val="24"/>
+            <w:szCs w:val="24"/>
+            <w:u w:val="single"/>
+          </w:rPr>
+          <w:t xml:space="preserve">MQTT.js</w:t>
+        </w:r>
+      </w:hyperlink>
+      <w:r>
+        <w:rPr>
+          <w:rFonts w:ascii="Times New Roman" w:cs="Times New Roman" w:eastAsia="SimSun" w:hAnsi="Times New Roman"/>
+          <w:color w:val="000000"/>
+          <w:sz w:val="24"/>
+          <w:szCs w:val="24"/>
+        </w:rPr>
+        <w:t xml:space="preserve">（9k 星）、</w:t>
+      </w:r>
+      <w:hyperlink w:history="1" r:id="rIdf5igesfklqcgynqprgoye">
+        <w:r>
+          <w:rPr>
+            <w:rFonts w:ascii="Times New Roman" w:cs="Times New Roman" w:eastAsia="SimSun" w:hAnsi="Times New Roman"/>
+            <w:color w:val="0563C1"/>
+            <w:sz w:val="24"/>
+            <w:szCs w:val="24"/>
+            <w:u w:val="single"/>
+          </w:rPr>
+          <w:t xml:space="preserve">Vue 3</w:t>
+        </w:r>
+      </w:hyperlink>
+      <w:r>
+        <w:rPr>
+          <w:rFonts w:ascii="Times New Roman" w:cs="Times New Roman" w:eastAsia="SimSun" w:hAnsi="Times New Roman"/>
+          <w:color w:val="000000"/>
+          <w:sz w:val="24"/>
+          <w:szCs w:val="24"/>
+        </w:rPr>
+        <w:t xml:space="preserve">（54k 星）、</w:t>
+      </w:r>
+      <w:hyperlink w:history="1" r:id="rId6pgdig1gt150g0rm37h5u">
+        <w:r>
+          <w:rPr>
+            <w:rFonts w:ascii="Times New Roman" w:cs="Times New Roman" w:eastAsia="SimSun" w:hAnsi="Times New Roman"/>
+            <w:color w:val="0563C1"/>
+            <w:sz w:val="24"/>
+            <w:szCs w:val="24"/>
+            <w:u w:val="single"/>
+          </w:rPr>
+          <w:t xml:space="preserve">ECharts</w:t>
+        </w:r>
+      </w:hyperlink>
+      <w:r>
+        <w:rPr>
+          <w:rFonts w:ascii="Times New Roman" w:cs="Times New Roman" w:eastAsia="SimSun" w:hAnsi="Times New Roman"/>
+          <w:color w:val="000000"/>
+          <w:sz w:val="24"/>
+          <w:szCs w:val="24"/>
+        </w:rPr>
+        <w:t xml:space="preserve">（67k 星）均已核验；</w:t>
+      </w:r>
+      <w:hyperlink w:history="1" r:id="rId4m6f4oesihwg3uf77fhhs">
         <w:r>
           <w:rPr>
             <w:rFonts w:ascii="Times New Roman" w:cs="Times New Roman" w:eastAsia="SimSun" w:hAnsi="Times New Roman"/>
@@ -3057,7 +3308,7 @@
           <w:sz w:val="24"/>
           <w:szCs w:val="24"/>
         </w:rPr>
-        <w:t xml:space="preserve">（16.5k 星）、Node-RED（23.5k 星）、农业岛 智慧农业平台（347 星，Java+Vue+Uni-app，支持 MQTT/EMQX）均已核验；OneNET 为中国移动免费物联网平台，教程量大。</w:t>
+        <w:t xml:space="preserve">（16.5k 星）与 OneNET 支持 ESP32 直连，教程量大。</w:t>
       </w:r>
     </w:p>
     <w:p>
@@ -3088,7 +3339,7 @@
           <w:sz w:val="24"/>
           <w:szCs w:val="24"/>
         </w:rPr>
-        <w:t xml:space="preserve">ESP32-CAM 算力有限，边缘推理只跑轻量模型，初期视觉走云端；司农 32B 本地部署需要较高显存，初期用 8B 或 DeepSeek API 替代。</w:t>
+        <w:t xml:space="preserve">ESP32-CAM 引脚少、供电敏感，需稳压供电与 I/O 规划；边缘算力有限，初期视觉推理走云端；司农 32B 本地部署显存要求高，初期用 8B 或 DeepSeek API 替代。</w:t>
       </w:r>
     </w:p>
     <w:p>
@@ -3121,7 +3372,7 @@
           <w:sz w:val="24"/>
           <w:szCs w:val="24"/>
         </w:rPr>
-        <w:t xml:space="preserve">核验方式：2026-08-07 通过 GitHub API 查询仓库全名、star 数、最近推送、是否归档；模型与数据集通过官方渠道与多家媒体报道交叉确认。</w:t>
+        <w:t xml:space="preserve">核验方式：2026-08-07/08-10 通过 GitHub API 查询仓库全名、star 数、最近推送、是否归档；模型与数据集通过官方渠道与多家媒体报道交叉确认。</w:t>
       </w:r>
     </w:p>
     <w:p>
@@ -3138,7 +3389,7 @@
           <w:sz w:val="24"/>
           <w:szCs w:val="24"/>
         </w:rPr>
-        <w:t xml:space="preserve">6.1 硬件/温室整机（STM32 侧）</w:t>
+        <w:t xml:space="preserve">6.1 硬件 / 整机（ESP32 侧）</w:t>
       </w:r>
     </w:p>
     <w:p>
@@ -3151,7 +3402,7 @@
         <w:spacing w:after="0" w:line="360"/>
         <w:jc w:val="both"/>
       </w:pPr>
-      <w:hyperlink w:history="1" r:id="rIdwouqn6hjpssrcoyjzvhci">
+      <w:hyperlink w:history="1" r:id="rId6hyzo7nfcxzmb3kyre4_d">
         <w:r>
           <w:rPr>
             <w:rFonts w:ascii="Times New Roman" w:cs="Times New Roman" w:eastAsia="SimSun" w:hAnsi="Times New Roman"/>
@@ -3160,7 +3411,7 @@
             <w:szCs w:val="24"/>
             <w:u w:val="single"/>
           </w:rPr>
-          <w:t xml:space="preserve">zhujiu39/stm32-flower-greenhouse</w:t>
+          <w:t xml:space="preserve">espressif/arduino-esp32</w:t>
         </w:r>
       </w:hyperlink>
       <w:r>
@@ -3170,7 +3421,7 @@
           <w:sz w:val="24"/>
           <w:szCs w:val="24"/>
         </w:rPr>
-        <w:t xml:space="preserve">（2026-06 更新，0 星，已核验）：STM32F103C8T6 花卉温室，OLED+继电器自动控制+ESP8266 MQTT+ThingsCloud，与现有 SmartAgriculture 几乎同构。</w:t>
+        <w:t xml:space="preserve">（17.2k 星，2026-08 更新，已核验）：乐鑫官方 Arduino 核心，ESP32-CAM 开发与示例的基准环境。</w:t>
       </w:r>
     </w:p>
     <w:p>
@@ -3183,7 +3434,7 @@
         <w:spacing w:after="0" w:line="360"/>
         <w:jc w:val="both"/>
       </w:pPr>
-      <w:hyperlink w:history="1" r:id="rIdu7wsnio2scmhhsdlkxxpb">
+      <w:hyperlink w:history="1" r:id="rIduyqjehk2vtnbvg9ef92th">
         <w:r>
           <w:rPr>
             <w:rFonts w:ascii="Times New Roman" w:cs="Times New Roman" w:eastAsia="SimSun" w:hAnsi="Times New Roman"/>
@@ -3192,7 +3443,7 @@
             <w:szCs w:val="24"/>
             <w:u w:val="single"/>
           </w:rPr>
-          <w:t xml:space="preserve">cz0729zc/smart-orchard-irrigation-system</w:t>
+          <w:t xml:space="preserve">SHN2004/Plant_Disease_Detection</w:t>
         </w:r>
       </w:hyperlink>
       <w:r>
@@ -3202,7 +3453,24 @@
           <w:sz w:val="24"/>
           <w:szCs w:val="24"/>
         </w:rPr>
-        <w:t xml:space="preserve">（26 星，已核验）：STM32+ESP8266 果园灌溉，土壤/光照/温湿度、自动灌溉、驱鸟、LED 补光、APP 远程控制，功能面最全。</w:t>
+        <w:t xml:space="preserve">（9 星，已核验）：ESP32-CAM + 深度学习实时植物病害检测全链路，与本项目视觉链路直接对口。</w:t>
+      </w:r>
+    </w:p>
+    <w:p>
+      <w:pPr>
+        <w:pStyle w:val="Heading3"/>
+        <w:keepNext/>
+        <w:spacing w:after="120" w:before="240" w:line="360"/>
+      </w:pPr>
+      <w:r>
+        <w:rPr>
+          <w:rFonts w:ascii="Times New Roman" w:cs="Times New Roman" w:eastAsia="SimSun" w:hAnsi="Times New Roman"/>
+          <w:b/>
+          <w:bCs/>
+          <w:sz w:val="24"/>
+          <w:szCs w:val="24"/>
+        </w:rPr>
+        <w:t xml:space="preserve">6.2 病虫害检测（视觉组）</w:t>
       </w:r>
     </w:p>
     <w:p>
@@ -3215,7 +3483,7 @@
         <w:spacing w:after="0" w:line="360"/>
         <w:jc w:val="both"/>
       </w:pPr>
-      <w:hyperlink w:history="1" r:id="rIdioxkalic7uqhyrep4fhdo">
+      <w:hyperlink w:history="1" r:id="rIdzx-b_628zetmwdpxzdz2j">
         <w:r>
           <w:rPr>
             <w:rFonts w:ascii="Times New Roman" w:cs="Times New Roman" w:eastAsia="SimSun" w:hAnsi="Times New Roman"/>
@@ -3224,7 +3492,7 @@
             <w:szCs w:val="24"/>
             <w:u w:val="single"/>
           </w:rPr>
-          <w:t xml:space="preserve">mcu-coder/stm32_environmental_monitoring</w:t>
+          <w:t xml:space="preserve">pratikkayal/PlantDoc-Dataset</w:t>
         </w:r>
       </w:hyperlink>
       <w:r>
@@ -3234,7 +3502,7 @@
           <w:sz w:val="24"/>
           <w:szCs w:val="24"/>
         </w:rPr>
-        <w:t xml:space="preserve">（20 星，已核验）：农业大棚环境监测系统（毕业设计案例）。</w:t>
+        <w:t xml:space="preserve">（427 星，已核验）：PlantDoc 官方数据集仓库（CODS-COMAD 2020 论文配套）。</w:t>
       </w:r>
     </w:p>
     <w:p>
@@ -3247,7 +3515,16 @@
         <w:spacing w:after="0" w:line="360"/>
         <w:jc w:val="both"/>
       </w:pPr>
-      <w:hyperlink w:history="1" r:id="rIdzedkgy7t73jxphlbsk4gv">
+      <w:r>
+        <w:rPr>
+          <w:rFonts w:ascii="Times New Roman" w:cs="Times New Roman" w:eastAsia="SimSun" w:hAnsi="Times New Roman"/>
+          <w:color w:val="000000"/>
+          <w:sz w:val="24"/>
+          <w:szCs w:val="24"/>
+        </w:rPr>
+        <w:t xml:space="preserve">PlantVillage 数据集（Kaggle </w:t>
+      </w:r>
+      <w:hyperlink w:history="1" r:id="rId-h1ylc63knp7se3x4bcbh">
         <w:r>
           <w:rPr>
             <w:rFonts w:ascii="Times New Roman" w:cs="Times New Roman" w:eastAsia="SimSun" w:hAnsi="Times New Roman"/>
@@ -3256,7 +3533,7 @@
             <w:szCs w:val="24"/>
             <w:u w:val="single"/>
           </w:rPr>
-          <w:t xml:space="preserve">lidonghang-02/greenhouse_control_system</w:t>
+          <w:t xml:space="preserve">abdallahalidev/plantvillage-dataset</w:t>
         </w:r>
       </w:hyperlink>
       <w:r>
@@ -3266,24 +3543,7 @@
           <w:sz w:val="24"/>
           <w:szCs w:val="24"/>
         </w:rPr>
-        <w:t xml:space="preserve">（13 星，已核验）：基于 STM32 的温室控制系统。</w:t>
-      </w:r>
-    </w:p>
-    <w:p>
-      <w:pPr>
-        <w:pStyle w:val="Heading3"/>
-        <w:keepNext/>
-        <w:spacing w:after="120" w:before="240" w:line="360"/>
-      </w:pPr>
-      <w:r>
-        <w:rPr>
-          <w:rFonts w:ascii="Times New Roman" w:cs="Times New Roman" w:eastAsia="SimSun" w:hAnsi="Times New Roman"/>
-          <w:b/>
-          <w:bCs/>
-          <w:sz w:val="24"/>
-          <w:szCs w:val="24"/>
-        </w:rPr>
-        <w:t xml:space="preserve">6.2 病虫害检测（视觉组）</w:t>
+        <w:t xml:space="preserve">，已核验）：5 万+ 叶片图、38 类。</w:t>
       </w:r>
     </w:p>
     <w:p>
@@ -3296,7 +3556,7 @@
         <w:spacing w:after="0" w:line="360"/>
         <w:jc w:val="both"/>
       </w:pPr>
-      <w:hyperlink w:history="1" r:id="rIdxihza9fjqtwoxfmnkytg2">
+      <w:hyperlink w:history="1" r:id="rIdkvf43yujjkr__eq1knes4">
         <w:r>
           <w:rPr>
             <w:rFonts w:ascii="Times New Roman" w:cs="Times New Roman" w:eastAsia="SimSun" w:hAnsi="Times New Roman"/>
@@ -3305,7 +3565,7 @@
             <w:szCs w:val="24"/>
             <w:u w:val="single"/>
           </w:rPr>
-          <w:t xml:space="preserve">pratikkayal/PlantDoc-Dataset</w:t>
+          <w:t xml:space="preserve">ajinkyapawar11/yolov8-crop-disease-monitoring</w:t>
         </w:r>
       </w:hyperlink>
       <w:r>
@@ -3315,7 +3575,7 @@
           <w:sz w:val="24"/>
           <w:szCs w:val="24"/>
         </w:rPr>
-        <w:t xml:space="preserve">（427 星，已核验）：PlantDoc 官方数据集仓库（CODS-COMAD 2020 论文配套）。</w:t>
+        <w:t xml:space="preserve">（0 星，2025-07 更新，已核验）：YOLOv8 温室作物病害实时检测（菠菜/生菜/白菜），场景最接近，作架构参考。</w:t>
       </w:r>
     </w:p>
     <w:p>
@@ -3328,16 +3588,7 @@
         <w:spacing w:after="0" w:line="360"/>
         <w:jc w:val="both"/>
       </w:pPr>
-      <w:r>
-        <w:rPr>
-          <w:rFonts w:ascii="Times New Roman" w:cs="Times New Roman" w:eastAsia="SimSun" w:hAnsi="Times New Roman"/>
-          <w:color w:val="000000"/>
-          <w:sz w:val="24"/>
-          <w:szCs w:val="24"/>
-        </w:rPr>
-        <w:t xml:space="preserve">PlantVillage 数据集（Kaggle </w:t>
-      </w:r>
-      <w:hyperlink w:history="1" r:id="rIdmqzisrcvlhuooiydjw5y9">
+      <w:hyperlink w:history="1" r:id="rIdzye4carfhc-f_d5kusb20">
         <w:r>
           <w:rPr>
             <w:rFonts w:ascii="Times New Roman" w:cs="Times New Roman" w:eastAsia="SimSun" w:hAnsi="Times New Roman"/>
@@ -3346,7 +3597,7 @@
             <w:szCs w:val="24"/>
             <w:u w:val="single"/>
           </w:rPr>
-          <w:t xml:space="preserve">abdallahalidev/plantvillage-dataset</w:t>
+          <w:t xml:space="preserve">vishnuskandha/strawberry-disease-detection</w:t>
         </w:r>
       </w:hyperlink>
       <w:r>
@@ -3356,7 +3607,7 @@
           <w:sz w:val="24"/>
           <w:szCs w:val="24"/>
         </w:rPr>
-        <w:t xml:space="preserve">，已核验）：5 万+ 叶片图、38 类。</w:t>
+        <w:t xml:space="preserve">（0 星，2026-04 更新，已核验）：YOLOv8 训练 + Streamlit 应用，工程量最小、最快出结果。</w:t>
       </w:r>
     </w:p>
     <w:p>
@@ -3369,7 +3620,7 @@
         <w:spacing w:after="0" w:line="360"/>
         <w:jc w:val="both"/>
       </w:pPr>
-      <w:hyperlink w:history="1" r:id="rIdbsxyqpxnjmzzcmesco3qn">
+      <w:hyperlink w:history="1" r:id="rIdqp1k1ihxiv23fdqflkrav">
         <w:r>
           <w:rPr>
             <w:rFonts w:ascii="Times New Roman" w:cs="Times New Roman" w:eastAsia="SimSun" w:hAnsi="Times New Roman"/>
@@ -3378,7 +3629,7 @@
             <w:szCs w:val="24"/>
             <w:u w:val="single"/>
           </w:rPr>
-          <w:t xml:space="preserve">ajinkyapawar11/yolov8-crop-disease-monitoring</w:t>
+          <w:t xml:space="preserve">Kuipyy/plant-disease-agent</w:t>
         </w:r>
       </w:hyperlink>
       <w:r>
@@ -3388,7 +3639,24 @@
           <w:sz w:val="24"/>
           <w:szCs w:val="24"/>
         </w:rPr>
-        <w:t xml:space="preserve">（0 星，2025-07 更新，已核验）：YOLOv8 温室作物病害实时检测（菠菜/生菜/白菜），场景最接近，作架构参考。</w:t>
+        <w:t xml:space="preserve">（0 星，2026-07 更新，已核验）：LLM 编排的病害诊断智能体（分类器 + Grad-CAM 可解释 + RAG 防治建议），与智能体想法直接对口。</w:t>
+      </w:r>
+    </w:p>
+    <w:p>
+      <w:pPr>
+        <w:pStyle w:val="Heading3"/>
+        <w:keepNext/>
+        <w:spacing w:after="120" w:before="240" w:line="360"/>
+      </w:pPr>
+      <w:r>
+        <w:rPr>
+          <w:rFonts w:ascii="Times New Roman" w:cs="Times New Roman" w:eastAsia="SimSun" w:hAnsi="Times New Roman"/>
+          <w:b/>
+          <w:bCs/>
+          <w:sz w:val="24"/>
+          <w:szCs w:val="24"/>
+        </w:rPr>
+        <w:t xml:space="preserve">6.3 生长状况分析</w:t>
       </w:r>
     </w:p>
     <w:p>
@@ -3401,7 +3669,7 @@
         <w:spacing w:after="0" w:line="360"/>
         <w:jc w:val="both"/>
       </w:pPr>
-      <w:hyperlink w:history="1" r:id="rIdtde7g-1_2fjfky8b82ye_">
+      <w:hyperlink w:history="1" r:id="rIdoolftszlotuqaspbxgodt">
         <w:r>
           <w:rPr>
             <w:rFonts w:ascii="Times New Roman" w:cs="Times New Roman" w:eastAsia="SimSun" w:hAnsi="Times New Roman"/>
@@ -3410,7 +3678,7 @@
             <w:szCs w:val="24"/>
             <w:u w:val="single"/>
           </w:rPr>
-          <w:t xml:space="preserve">SHN2004/Plant_Disease_Detection</w:t>
+          <w:t xml:space="preserve">Tharinda-Pamindu/Plant-Growth-anaysis-measure-project</w:t>
         </w:r>
       </w:hyperlink>
       <w:r>
@@ -3420,7 +3688,7 @@
           <w:sz w:val="24"/>
           <w:szCs w:val="24"/>
         </w:rPr>
-        <w:t xml:space="preserve">（9 星，已核验）：ESP32-CAM + 深度学习实时植物病害检测全链路。</w:t>
+        <w:t xml:space="preserve">（1 星，已核验）：视觉测量叶片数/株高/健康度，正合“自动分析生长状况”。</w:t>
       </w:r>
     </w:p>
     <w:p>
@@ -3433,7 +3701,7 @@
         <w:spacing w:after="0" w:line="360"/>
         <w:jc w:val="both"/>
       </w:pPr>
-      <w:hyperlink w:history="1" r:id="rIdyenyj4_qudjjmph7t_0j7">
+      <w:hyperlink w:history="1" r:id="rIdfy20hukwtb2qlwqpjla8u">
         <w:r>
           <w:rPr>
             <w:rFonts w:ascii="Times New Roman" w:cs="Times New Roman" w:eastAsia="SimSun" w:hAnsi="Times New Roman"/>
@@ -3442,7 +3710,7 @@
             <w:szCs w:val="24"/>
             <w:u w:val="single"/>
           </w:rPr>
-          <w:t xml:space="preserve">vishnuskandha/strawberry-disease-detection</w:t>
+          <w:t xml:space="preserve">mriglab/GroMo-Plant-Growth-Modeling-with-Multiview-Images</w:t>
         </w:r>
       </w:hyperlink>
       <w:r>
@@ -3452,7 +3720,24 @@
           <w:sz w:val="24"/>
           <w:szCs w:val="24"/>
         </w:rPr>
-        <w:t xml:space="preserve">（0 星，2026-04 更新，已核验）：YOLOv8 训练 + Streamlit 应用，工程量最小、最快出结果。</w:t>
+        <w:t xml:space="preserve">（6 星，2026-04 更新，已核验）：多视角图像生长建模竞赛项目，作进阶参考。</w:t>
+      </w:r>
+    </w:p>
+    <w:p>
+      <w:pPr>
+        <w:pStyle w:val="Heading3"/>
+        <w:keepNext/>
+        <w:spacing w:after="120" w:before="240" w:line="360"/>
+      </w:pPr>
+      <w:r>
+        <w:rPr>
+          <w:rFonts w:ascii="Times New Roman" w:cs="Times New Roman" w:eastAsia="SimSun" w:hAnsi="Times New Roman"/>
+          <w:b/>
+          <w:bCs/>
+          <w:sz w:val="24"/>
+          <w:szCs w:val="24"/>
+        </w:rPr>
+        <w:t xml:space="preserve">6.4 农业大模型 / 智能体</w:t>
       </w:r>
     </w:p>
     <w:p>
@@ -3465,18 +3750,6 @@
         <w:spacing w:after="0" w:line="360"/>
         <w:jc w:val="both"/>
       </w:pPr>
-      <w:hyperlink w:history="1" r:id="rIdsathvvy17rk7qfa0i4v-s">
-        <w:r>
-          <w:rPr>
-            <w:rFonts w:ascii="Times New Roman" w:cs="Times New Roman" w:eastAsia="SimSun" w:hAnsi="Times New Roman"/>
-            <w:color w:val="0563C1"/>
-            <w:sz w:val="24"/>
-            <w:szCs w:val="24"/>
-            <w:u w:val="single"/>
-          </w:rPr>
-          <w:t xml:space="preserve">Kuipyy/plant-disease-agent</w:t>
-        </w:r>
-      </w:hyperlink>
       <w:r>
         <w:rPr>
           <w:rFonts w:ascii="Times New Roman" w:cs="Times New Roman" w:eastAsia="SimSun" w:hAnsi="Times New Roman"/>
@@ -3484,24 +3757,7 @@
           <w:sz w:val="24"/>
           <w:szCs w:val="24"/>
         </w:rPr>
-        <w:t xml:space="preserve">（0 星，2026-07 更新，已核验）：LLM 编排的病害诊断智能体（分类器 + Grad-CAM 可解释 + RAG 防治建议），与智能体想法直接对口。</w:t>
-      </w:r>
-    </w:p>
-    <w:p>
-      <w:pPr>
-        <w:pStyle w:val="Heading3"/>
-        <w:keepNext/>
-        <w:spacing w:after="120" w:before="240" w:line="360"/>
-      </w:pPr>
-      <w:r>
-        <w:rPr>
-          <w:rFonts w:ascii="Times New Roman" w:cs="Times New Roman" w:eastAsia="SimSun" w:hAnsi="Times New Roman"/>
-          <w:b/>
-          <w:bCs/>
-          <w:sz w:val="24"/>
-          <w:szCs w:val="24"/>
-        </w:rPr>
-        <w:t xml:space="preserve">6.3 生长状况分析</w:t>
+        <w:t xml:space="preserve">司农（南京农业大学，2026-01 发布，已核验）：国内首个农业开源大语言模型，8B/32B，魔搭+GitHub 开源（IT之家、中国农科院官网、新华报业网等多家交叉报道）。</w:t>
       </w:r>
     </w:p>
     <w:p>
@@ -3514,7 +3770,7 @@
         <w:spacing w:after="0" w:line="360"/>
         <w:jc w:val="both"/>
       </w:pPr>
-      <w:hyperlink w:history="1" r:id="rIdwtrrzgqilouaxvkvxmxqa">
+      <w:hyperlink w:history="1" r:id="rIdrsjkv-4mw_qeeohtk_y4x">
         <w:r>
           <w:rPr>
             <w:rFonts w:ascii="Times New Roman" w:cs="Times New Roman" w:eastAsia="SimSun" w:hAnsi="Times New Roman"/>
@@ -3523,7 +3779,7 @@
             <w:szCs w:val="24"/>
             <w:u w:val="single"/>
           </w:rPr>
-          <w:t xml:space="preserve">Tharinda-Pamindu/Plant-Growth-anaysis-measure-project</w:t>
+          <w:t xml:space="preserve">zhiweihu1103/AgriAgent</w:t>
         </w:r>
       </w:hyperlink>
       <w:r>
@@ -3533,7 +3789,7 @@
           <w:sz w:val="24"/>
           <w:szCs w:val="24"/>
         </w:rPr>
-        <w:t xml:space="preserve">（1 星，已核验）：视觉测量叶片数/株高/健康度，正合“自动分析生长状况”。</w:t>
+        <w:t xml:space="preserve">（稷丰，125 星，已核验）：首个开源中文农业多模态大模型（图像+文本+气象）。</w:t>
       </w:r>
     </w:p>
     <w:p>
@@ -3546,7 +3802,7 @@
         <w:spacing w:after="0" w:line="360"/>
         <w:jc w:val="both"/>
       </w:pPr>
-      <w:hyperlink w:history="1" r:id="rIdmbcue7zhwzntaoias8dzh">
+      <w:hyperlink w:history="1" r:id="rIdkbj1yfmy32xgoxcnkaaxh">
         <w:r>
           <w:rPr>
             <w:rFonts w:ascii="Times New Roman" w:cs="Times New Roman" w:eastAsia="SimSun" w:hAnsi="Times New Roman"/>
@@ -3555,7 +3811,7 @@
             <w:szCs w:val="24"/>
             <w:u w:val="single"/>
           </w:rPr>
-          <w:t xml:space="preserve">mriglab/GroMo-Plant-Growth-Modeling-with-Multiview-Images</w:t>
+          <w:t xml:space="preserve">csg2008/InternLMAgricultureAssistant</w:t>
         </w:r>
       </w:hyperlink>
       <w:r>
@@ -3565,24 +3821,7 @@
           <w:sz w:val="24"/>
           <w:szCs w:val="24"/>
         </w:rPr>
-        <w:t xml:space="preserve">（6 星，2026-04 更新，已核验）：多视角图像生长建模竞赛项目，作进阶参考。</w:t>
-      </w:r>
-    </w:p>
-    <w:p>
-      <w:pPr>
-        <w:pStyle w:val="Heading3"/>
-        <w:keepNext/>
-        <w:spacing w:after="120" w:before="240" w:line="360"/>
-      </w:pPr>
-      <w:r>
-        <w:rPr>
-          <w:rFonts w:ascii="Times New Roman" w:cs="Times New Roman" w:eastAsia="SimSun" w:hAnsi="Times New Roman"/>
-          <w:b/>
-          <w:bCs/>
-          <w:sz w:val="24"/>
-          <w:szCs w:val="24"/>
-        </w:rPr>
-        <w:t xml:space="preserve">6.4 农业大模型 / 智能体</w:t>
+        <w:t xml:space="preserve">（3 星，已核验）：书生浦语农业助手——传感器+执行器+大模型自动控制大棚环境，理念最接近的完整参考。</w:t>
       </w:r>
     </w:p>
     <w:p>
@@ -3595,6 +3834,18 @@
         <w:spacing w:after="0" w:line="360"/>
         <w:jc w:val="both"/>
       </w:pPr>
+      <w:hyperlink w:history="1" r:id="rIdnq85ft5ci6-vunj0qpk-y">
+        <w:r>
+          <w:rPr>
+            <w:rFonts w:ascii="Times New Roman" w:cs="Times New Roman" w:eastAsia="SimSun" w:hAnsi="Times New Roman"/>
+            <w:color w:val="0563C1"/>
+            <w:sz w:val="24"/>
+            <w:szCs w:val="24"/>
+            <w:u w:val="single"/>
+          </w:rPr>
+          <w:t xml:space="preserve">nirmal2i43a5/AgriGen</w:t>
+        </w:r>
+      </w:hyperlink>
       <w:r>
         <w:rPr>
           <w:rFonts w:ascii="Times New Roman" w:cs="Times New Roman" w:eastAsia="SimSun" w:hAnsi="Times New Roman"/>
@@ -3602,7 +3853,7 @@
           <w:sz w:val="24"/>
           <w:szCs w:val="24"/>
         </w:rPr>
-        <w:t xml:space="preserve">司农（南京农业大学，2026-01 发布，已核验）：国内首个农业开源大语言模型，8B/32B，魔搭+GitHub 开源（IT之家、中国农科院官网、新华报业网等多家交叉报道）。</w:t>
+        <w:t xml:space="preserve">（0 星，2026-02 更新，已核验）：RAG + Llama 3.3 农业咨询助手。</w:t>
       </w:r>
     </w:p>
     <w:p>
@@ -3615,7 +3866,7 @@
         <w:spacing w:after="0" w:line="360"/>
         <w:jc w:val="both"/>
       </w:pPr>
-      <w:hyperlink w:history="1" r:id="rIdn-6lizp0i6b9b-ggu655c">
+      <w:hyperlink w:history="1" r:id="rIdclr-5ehlmpqr5u829mrn5">
         <w:r>
           <w:rPr>
             <w:rFonts w:ascii="Times New Roman" w:cs="Times New Roman" w:eastAsia="SimSun" w:hAnsi="Times New Roman"/>
@@ -3624,7 +3875,7 @@
             <w:szCs w:val="24"/>
             <w:u w:val="single"/>
           </w:rPr>
-          <w:t xml:space="preserve">zhiweihu1103/AgriAgent</w:t>
+          <w:t xml:space="preserve">Shuvam-Banerji-Seal/AgriIR</w:t>
         </w:r>
       </w:hyperlink>
       <w:r>
@@ -3634,7 +3885,7 @@
           <w:sz w:val="24"/>
           <w:szCs w:val="24"/>
         </w:rPr>
-        <w:t xml:space="preserve">（稷丰，125 星，已核验）：首个开源中文农业多模态大模型（图像+文本+气象）。</w:t>
+        <w:t xml:space="preserve">（6 星，ECIR'26，已核验）：农业 RAG 六阶段流水线，检索+引用可溯源。</w:t>
       </w:r>
     </w:p>
     <w:p>
@@ -3647,7 +3898,7 @@
         <w:spacing w:after="0" w:line="360"/>
         <w:jc w:val="both"/>
       </w:pPr>
-      <w:hyperlink w:history="1" r:id="rId0bvryivhvqfon_awmzihj">
+      <w:hyperlink w:history="1" r:id="rIdzplxmhuyucbiikrckt1bs">
         <w:r>
           <w:rPr>
             <w:rFonts w:ascii="Times New Roman" w:cs="Times New Roman" w:eastAsia="SimSun" w:hAnsi="Times New Roman"/>
@@ -3656,7 +3907,7 @@
             <w:szCs w:val="24"/>
             <w:u w:val="single"/>
           </w:rPr>
-          <w:t xml:space="preserve">csg2008/InternLMAgricultureAssistant</w:t>
+          <w:t xml:space="preserve">vios-s/PhenoAssistant</w:t>
         </w:r>
       </w:hyperlink>
       <w:r>
@@ -3666,7 +3917,7 @@
           <w:sz w:val="24"/>
           <w:szCs w:val="24"/>
         </w:rPr>
-        <w:t xml:space="preserve">（3 星，已核验）：书生浦语农业助手——传感器+执行器+大模型自动控制大棚环境，理念最接近的完整参考。</w:t>
+        <w:t xml:space="preserve">（35 星，2026-07 更新，已核验）：多智能体植物表型分析系统，智能体架构参考。</w:t>
       </w:r>
     </w:p>
     <w:p>
@@ -3679,7 +3930,7 @@
         <w:spacing w:after="0" w:line="360"/>
         <w:jc w:val="both"/>
       </w:pPr>
-      <w:hyperlink w:history="1" r:id="rIdnxthdcn8aagjgijf6iwhu">
+      <w:hyperlink w:history="1" r:id="rIdbh6cikmjx9r9xpm57bjgk">
         <w:r>
           <w:rPr>
             <w:rFonts w:ascii="Times New Roman" w:cs="Times New Roman" w:eastAsia="SimSun" w:hAnsi="Times New Roman"/>
@@ -3688,7 +3939,7 @@
             <w:szCs w:val="24"/>
             <w:u w:val="single"/>
           </w:rPr>
-          <w:t xml:space="preserve">nirmal2i43a5/AgriGen</w:t>
+          <w:t xml:space="preserve">langgenius/dify</w:t>
         </w:r>
       </w:hyperlink>
       <w:r>
@@ -3698,7 +3949,7 @@
           <w:sz w:val="24"/>
           <w:szCs w:val="24"/>
         </w:rPr>
-        <w:t xml:space="preserve">（0 星，2026-02 更新，已核验）：RAG + Llama 3.3 农业咨询助手。</w:t>
+        <w:t xml:space="preserve">（151k 星，已核验）：开源智能体/工作流平台，HTTP API 可被 Node.js 后端调用（可选编排层）。</w:t>
       </w:r>
     </w:p>
     <w:p>
@@ -3711,7 +3962,7 @@
         <w:spacing w:after="0" w:line="360"/>
         <w:jc w:val="both"/>
       </w:pPr>
-      <w:hyperlink w:history="1" r:id="rIdqrkkgvpeeufegmrlocisp">
+      <w:hyperlink w:history="1" r:id="rIdgnplh4xsnwr9vzq7pjdrj">
         <w:r>
           <w:rPr>
             <w:rFonts w:ascii="Times New Roman" w:cs="Times New Roman" w:eastAsia="SimSun" w:hAnsi="Times New Roman"/>
@@ -3720,7 +3971,7 @@
             <w:szCs w:val="24"/>
             <w:u w:val="single"/>
           </w:rPr>
-          <w:t xml:space="preserve">Shuvam-Banerji-Seal/AgriIR</w:t>
+          <w:t xml:space="preserve">infiniflow/ragflow</w:t>
         </w:r>
       </w:hyperlink>
       <w:r>
@@ -3730,7 +3981,7 @@
           <w:sz w:val="24"/>
           <w:szCs w:val="24"/>
         </w:rPr>
-        <w:t xml:space="preserve">（6 星，ECIR'26，已核验）：农业 RAG 六阶段流水线，检索+引用可溯源。</w:t>
+        <w:t xml:space="preserve">（87k 星，已核验）：开源 RAG 引擎，HTTP API 可被 Node.js 后端调用。</w:t>
       </w:r>
     </w:p>
     <w:p>
@@ -3743,7 +3994,7 @@
         <w:spacing w:after="0" w:line="360"/>
         <w:jc w:val="both"/>
       </w:pPr>
-      <w:hyperlink w:history="1" r:id="rIdb4vdzqag0grrtocpowx2a">
+      <w:hyperlink w:history="1" r:id="rIdd6e5g5mpoh_e8xb8i4ho9">
         <w:r>
           <w:rPr>
             <w:rFonts w:ascii="Times New Roman" w:cs="Times New Roman" w:eastAsia="SimSun" w:hAnsi="Times New Roman"/>
@@ -3752,7 +4003,7 @@
             <w:szCs w:val="24"/>
             <w:u w:val="single"/>
           </w:rPr>
-          <w:t xml:space="preserve">vios-s/PhenoAssistant</w:t>
+          <w:t xml:space="preserve">ultralytics/ultralytics</w:t>
         </w:r>
       </w:hyperlink>
       <w:r>
@@ -3762,7 +4013,24 @@
           <w:sz w:val="24"/>
           <w:szCs w:val="24"/>
         </w:rPr>
-        <w:t xml:space="preserve">（35 星，2026-07 更新，已核验）：多智能体植物表型分析系统，智能体架构参考。</w:t>
+        <w:t xml:space="preserve">（60k 星，已核验）：YOLOv8/YOLO11 框架（视觉服务为独立 Python 服务，由 Node.js 编排调用）。</w:t>
+      </w:r>
+    </w:p>
+    <w:p>
+      <w:pPr>
+        <w:pStyle w:val="Heading3"/>
+        <w:keepNext/>
+        <w:spacing w:after="120" w:before="240" w:line="360"/>
+      </w:pPr>
+      <w:r>
+        <w:rPr>
+          <w:rFonts w:ascii="Times New Roman" w:cs="Times New Roman" w:eastAsia="SimSun" w:hAnsi="Times New Roman"/>
+          <w:b/>
+          <w:bCs/>
+          <w:sz w:val="24"/>
+          <w:szCs w:val="24"/>
+        </w:rPr>
+        <w:t xml:space="preserve">6.5 平台 / 前端 / 可视化（Node.js + Vue）</w:t>
       </w:r>
     </w:p>
     <w:p>
@@ -3775,7 +4043,7 @@
         <w:spacing w:after="0" w:line="360"/>
         <w:jc w:val="both"/>
       </w:pPr>
-      <w:hyperlink w:history="1" r:id="rIdylj7aherrsdje8g41rsh1">
+      <w:hyperlink w:history="1" r:id="rIdqo_9sc4lndtruqoz4e29w">
         <w:r>
           <w:rPr>
             <w:rFonts w:ascii="Times New Roman" w:cs="Times New Roman" w:eastAsia="SimSun" w:hAnsi="Times New Roman"/>
@@ -3784,7 +4052,7 @@
             <w:szCs w:val="24"/>
             <w:u w:val="single"/>
           </w:rPr>
-          <w:t xml:space="preserve">langgenius/dify</w:t>
+          <w:t xml:space="preserve">expressjs/express</w:t>
         </w:r>
       </w:hyperlink>
       <w:r>
@@ -3794,7 +4062,7 @@
           <w:sz w:val="24"/>
           <w:szCs w:val="24"/>
         </w:rPr>
-        <w:t xml:space="preserve">（151k 星，已核验）：开源智能体/工作流平台，官方文档确认 HTTP Request 节点可调外部 API（设备控制通道）。</w:t>
+        <w:t xml:space="preserve">（69.4k 星，已核验）：Node.js Web 框架，REST/WebSocket API 底座。</w:t>
       </w:r>
     </w:p>
     <w:p>
@@ -3807,7 +4075,7 @@
         <w:spacing w:after="0" w:line="360"/>
         <w:jc w:val="both"/>
       </w:pPr>
-      <w:hyperlink w:history="1" r:id="rIdjh_bt0qa9dbhndq7lopou">
+      <w:hyperlink w:history="1" r:id="rIdndytu-fexyht2edbpro7j">
         <w:r>
           <w:rPr>
             <w:rFonts w:ascii="Times New Roman" w:cs="Times New Roman" w:eastAsia="SimSun" w:hAnsi="Times New Roman"/>
@@ -3816,7 +4084,7 @@
             <w:szCs w:val="24"/>
             <w:u w:val="single"/>
           </w:rPr>
-          <w:t xml:space="preserve">infiniflow/ragflow</w:t>
+          <w:t xml:space="preserve">mqttjs/MQTT.js</w:t>
         </w:r>
       </w:hyperlink>
       <w:r>
@@ -3826,7 +4094,7 @@
           <w:sz w:val="24"/>
           <w:szCs w:val="24"/>
         </w:rPr>
-        <w:t xml:space="preserve">（87k 星，已核验）：开源 RAG 引擎，知识库问答底座。</w:t>
+        <w:t xml:space="preserve">（9.1k 星，已核验）：Node.js MQTT 客户端，云端接入层。</w:t>
       </w:r>
     </w:p>
     <w:p>
@@ -3839,7 +4107,7 @@
         <w:spacing w:after="0" w:line="360"/>
         <w:jc w:val="both"/>
       </w:pPr>
-      <w:hyperlink w:history="1" r:id="rIdbqlvajbgoicgvks0ytt9e">
+      <w:hyperlink w:history="1" r:id="rId_yprucu3468eqgf0023t_">
         <w:r>
           <w:rPr>
             <w:rFonts w:ascii="Times New Roman" w:cs="Times New Roman" w:eastAsia="SimSun" w:hAnsi="Times New Roman"/>
@@ -3848,7 +4116,7 @@
             <w:szCs w:val="24"/>
             <w:u w:val="single"/>
           </w:rPr>
-          <w:t xml:space="preserve">ultralytics/ultralytics</w:t>
+          <w:t xml:space="preserve">vuejs/core</w:t>
         </w:r>
       </w:hyperlink>
       <w:r>
@@ -3858,24 +4126,7 @@
           <w:sz w:val="24"/>
           <w:szCs w:val="24"/>
         </w:rPr>
-        <w:t xml:space="preserve">（60k 星，已核验）：YOLOv8/YOLO11 框架。</w:t>
-      </w:r>
-    </w:p>
-    <w:p>
-      <w:pPr>
-        <w:pStyle w:val="Heading3"/>
-        <w:keepNext/>
-        <w:spacing w:after="120" w:before="240" w:line="360"/>
-      </w:pPr>
-      <w:r>
-        <w:rPr>
-          <w:rFonts w:ascii="Times New Roman" w:cs="Times New Roman" w:eastAsia="SimSun" w:hAnsi="Times New Roman"/>
-          <w:b/>
-          <w:bCs/>
-          <w:sz w:val="24"/>
-          <w:szCs w:val="24"/>
-        </w:rPr>
-        <w:t xml:space="preserve">6.5 云平台 / 小程序 / 可视化</w:t>
+        <w:t xml:space="preserve">（Vue 3，54.2k 星，已核验）：前端框架，大屏/控制页/问答界面。</w:t>
       </w:r>
     </w:p>
     <w:p>
@@ -3888,7 +4139,7 @@
         <w:spacing w:after="0" w:line="360"/>
         <w:jc w:val="both"/>
       </w:pPr>
-      <w:hyperlink w:history="1" r:id="rIdw8z4vziiq7bzku5rp-dro">
+      <w:hyperlink w:history="1" r:id="rIdgpnegkpb4gj_xgixz5kvw">
         <w:r>
           <w:rPr>
             <w:rFonts w:ascii="Times New Roman" w:cs="Times New Roman" w:eastAsia="SimSun" w:hAnsi="Times New Roman"/>
@@ -3897,7 +4148,7 @@
             <w:szCs w:val="24"/>
             <w:u w:val="single"/>
           </w:rPr>
-          <w:t xml:space="preserve">roinli/HUIZHI-nongyeOS-cloud</w:t>
+          <w:t xml:space="preserve">apache/echarts</w:t>
         </w:r>
       </w:hyperlink>
       <w:r>
@@ -3907,7 +4158,7 @@
           <w:sz w:val="24"/>
           <w:szCs w:val="24"/>
         </w:rPr>
-        <w:t xml:space="preserve">（农业岛，347 星，已核验）：Java+Vue+Uni-app 完整开源农业物联网平台，温棚监控/设备控制/大屏/小程序全有，可二开。</w:t>
+        <w:t xml:space="preserve">（67k 星，已核验）：可视化图表库，实时曲线与看板。</w:t>
       </w:r>
     </w:p>
     <w:p>
@@ -3920,7 +4171,7 @@
         <w:spacing w:after="0" w:line="360"/>
         <w:jc w:val="both"/>
       </w:pPr>
-      <w:hyperlink w:history="1" r:id="rIdu81cb8-kflujya80q-xey">
+      <w:hyperlink w:history="1" r:id="rIdqesfm5uuqyvjtmrjk3yj8">
         <w:r>
           <w:rPr>
             <w:rFonts w:ascii="Times New Roman" w:cs="Times New Roman" w:eastAsia="SimSun" w:hAnsi="Times New Roman"/>
@@ -3929,7 +4180,7 @@
             <w:szCs w:val="24"/>
             <w:u w:val="single"/>
           </w:rPr>
-          <w:t xml:space="preserve">CJL-build/-</w:t>
+          <w:t xml:space="preserve">emqx/emqx</w:t>
         </w:r>
       </w:hyperlink>
       <w:r>
@@ -3939,7 +4190,7 @@
           <w:sz w:val="24"/>
           <w:szCs w:val="24"/>
         </w:rPr>
-        <w:t xml:space="preserve">（4 星，已核验）：完整 IoT 项目（Vue 网页+微信小程序+SpringBoot 后端+硬件），含“湿度+温度+光照综合判断自动浇水”逻辑。</w:t>
+        <w:t xml:space="preserve">（16.5k 星，已核验）：MQTT Broker。</w:t>
       </w:r>
     </w:p>
     <w:p>
@@ -3952,71 +4203,7 @@
         <w:spacing w:after="0" w:line="360"/>
         <w:jc w:val="both"/>
       </w:pPr>
-      <w:hyperlink w:history="1" r:id="rIdpq2gevnawz3e80mqb6onn">
-        <w:r>
-          <w:rPr>
-            <w:rFonts w:ascii="Times New Roman" w:cs="Times New Roman" w:eastAsia="SimSun" w:hAnsi="Times New Roman"/>
-            <w:color w:val="0563C1"/>
-            <w:sz w:val="24"/>
-            <w:szCs w:val="24"/>
-            <w:u w:val="single"/>
-          </w:rPr>
-          <w:t xml:space="preserve">node-red/node-red</w:t>
-        </w:r>
-      </w:hyperlink>
-      <w:r>
-        <w:rPr>
-          <w:rFonts w:ascii="Times New Roman" w:cs="Times New Roman" w:eastAsia="SimSun" w:hAnsi="Times New Roman"/>
-          <w:color w:val="000000"/>
-          <w:sz w:val="24"/>
-          <w:szCs w:val="24"/>
-        </w:rPr>
-        <w:t xml:space="preserve">（23.5k 星，已核验）：MQTT 数据可视化低代码工具。</w:t>
-      </w:r>
-    </w:p>
-    <w:p>
-      <w:pPr>
-        <w:pStyle w:val="ListParagraph"/>
-        <w:numPr>
-          <w:ilvl w:val="0"/>
-          <w:numId w:val="2"/>
-        </w:numPr>
-        <w:spacing w:after="0" w:line="360"/>
-        <w:jc w:val="both"/>
-      </w:pPr>
-      <w:hyperlink w:history="1" r:id="rIduv88pguit05voqyjvj3us">
-        <w:r>
-          <w:rPr>
-            <w:rFonts w:ascii="Times New Roman" w:cs="Times New Roman" w:eastAsia="SimSun" w:hAnsi="Times New Roman"/>
-            <w:color w:val="0563C1"/>
-            <w:sz w:val="24"/>
-            <w:szCs w:val="24"/>
-            <w:u w:val="single"/>
-          </w:rPr>
-          <w:t xml:space="preserve">emqx/emqx</w:t>
-        </w:r>
-      </w:hyperlink>
-      <w:r>
-        <w:rPr>
-          <w:rFonts w:ascii="Times New Roman" w:cs="Times New Roman" w:eastAsia="SimSun" w:hAnsi="Times New Roman"/>
-          <w:color w:val="000000"/>
-          <w:sz w:val="24"/>
-          <w:szCs w:val="24"/>
-        </w:rPr>
-        <w:t xml:space="preserve">（16.5k 星，已核验）：MQTT Broker。</w:t>
-      </w:r>
-    </w:p>
-    <w:p>
-      <w:pPr>
-        <w:pStyle w:val="ListParagraph"/>
-        <w:numPr>
-          <w:ilvl w:val="0"/>
-          <w:numId w:val="2"/>
-        </w:numPr>
-        <w:spacing w:after="0" w:line="360"/>
-        <w:jc w:val="both"/>
-      </w:pPr>
-      <w:hyperlink w:history="1" r:id="rIdhlorrqxjwsp1bjlbee1s0">
+      <w:hyperlink w:history="1" r:id="rIdestb-ws57dafsfppekoeg">
         <w:r>
           <w:rPr>
             <w:rFonts w:ascii="Times New Roman" w:cs="Times New Roman" w:eastAsia="SimSun" w:hAnsi="Times New Roman"/>
@@ -4035,7 +4222,7 @@
           <w:sz w:val="24"/>
           <w:szCs w:val="24"/>
         </w:rPr>
-        <w:t xml:space="preserve">（中国移动物联网开放平台，已核验）：免费云平台，STM32+ESP8266 接入教程量大。</w:t>
+        <w:t xml:space="preserve">（中国移动物联网开放平台，已核验）：免费云平台，ESP32 MQTT 直连教程量大。</w:t>
       </w:r>
     </w:p>
     <w:p>
@@ -4068,8 +4255,8 @@
         </w:tblBorders>
       </w:tblPr>
       <w:tblGrid>
-        <w:gridCol w:w="3100"/>
-        <w:gridCol w:w="5972"/>
+        <w:gridCol w:w="3400"/>
+        <w:gridCol w:w="5672"/>
       </w:tblGrid>
       <w:tr>
         <w:trPr>
@@ -4077,7 +4264,7 @@
         </w:trPr>
         <w:tc>
           <w:tcPr>
-            <w:tcW w:type="dxa" w:w="3100"/>
+            <w:tcW w:type="dxa" w:w="3400"/>
             <w:tcBorders>
               <w:bottom w:val="single" w:color="000000" w:sz="6" w:space="0"/>
             </w:tcBorders>
@@ -4108,7 +4295,7 @@
         </w:tc>
         <w:tc>
           <w:tcPr>
-            <w:tcW w:type="dxa" w:w="5972"/>
+            <w:tcW w:type="dxa" w:w="5672"/>
             <w:tcBorders>
               <w:bottom w:val="single" w:color="000000" w:sz="6" w:space="0"/>
             </w:tcBorders>
@@ -4144,34 +4331,34 @@
         </w:trPr>
         <w:tc>
           <w:tcPr>
-            <w:tcW w:type="dxa" w:w="3100"/>
-            <w:tcMar>
-              <w:top w:type="dxa" w:w="40"/>
-              <w:left w:type="dxa" w:w="80"/>
-              <w:bottom w:type="dxa" w:w="40"/>
-              <w:right w:type="dxa" w:w="80"/>
-            </w:tcMar>
-            <w:vAlign w:val="center"/>
-          </w:tcPr>
-          <w:p>
-            <w:pPr>
-              <w:spacing w:after="0" w:line="240"/>
-              <w:jc w:val="center"/>
-            </w:pPr>
-            <w:r>
-              <w:rPr>
-                <w:rFonts w:ascii="Times New Roman" w:cs="Times New Roman" w:eastAsia="SimSun" w:hAnsi="Times New Roman"/>
-                <w:color w:val="000000"/>
-                <w:sz w:val="21"/>
-                <w:szCs w:val="21"/>
-              </w:rPr>
-              <w:t xml:space="preserve">STM32F103C8T6 核心板</w:t>
-            </w:r>
-          </w:p>
-        </w:tc>
-        <w:tc>
-          <w:tcPr>
-            <w:tcW w:type="dxa" w:w="5972"/>
+            <w:tcW w:type="dxa" w:w="3400"/>
+            <w:tcMar>
+              <w:top w:type="dxa" w:w="40"/>
+              <w:left w:type="dxa" w:w="80"/>
+              <w:bottom w:type="dxa" w:w="40"/>
+              <w:right w:type="dxa" w:w="80"/>
+            </w:tcMar>
+            <w:vAlign w:val="center"/>
+          </w:tcPr>
+          <w:p>
+            <w:pPr>
+              <w:spacing w:after="0" w:line="240"/>
+              <w:jc w:val="center"/>
+            </w:pPr>
+            <w:r>
+              <w:rPr>
+                <w:rFonts w:ascii="Times New Roman" w:cs="Times New Roman" w:eastAsia="SimSun" w:hAnsi="Times New Roman"/>
+                <w:color w:val="000000"/>
+                <w:sz w:val="21"/>
+                <w:szCs w:val="21"/>
+              </w:rPr>
+              <w:t xml:space="preserve">ESP32-CAM 开发板（OV2640 + microSD 卡槽）</w:t>
+            </w:r>
+          </w:p>
+        </w:tc>
+        <w:tc>
+          <w:tcPr>
+            <w:tcW w:type="dxa" w:w="5672"/>
             <w:tcMar>
               <w:top w:type="dxa" w:w="40"/>
               <w:left w:type="dxa" w:w="80"/>
@@ -4192,7 +4379,7 @@
                 <w:sz w:val="21"/>
                 <w:szCs w:val="21"/>
               </w:rPr>
-              <w:t xml:space="preserve">主控</w:t>
+              <w:t xml:space="preserve">主控：数据采集、拍照、联网、控制</w:t>
             </w:r>
           </w:p>
         </w:tc>
@@ -4203,7 +4390,7 @@
         </w:trPr>
         <w:tc>
           <w:tcPr>
-            <w:tcW w:type="dxa" w:w="3100"/>
+            <w:tcW w:type="dxa" w:w="3400"/>
             <w:tcMar>
               <w:top w:type="dxa" w:w="40"/>
               <w:left w:type="dxa" w:w="80"/>
@@ -4230,7 +4417,7 @@
         </w:tc>
         <w:tc>
           <w:tcPr>
-            <w:tcW w:type="dxa" w:w="5972"/>
+            <w:tcW w:type="dxa" w:w="5672"/>
             <w:tcMar>
               <w:top w:type="dxa" w:w="40"/>
               <w:left w:type="dxa" w:w="80"/>
@@ -4262,7 +4449,7 @@
         </w:trPr>
         <w:tc>
           <w:tcPr>
-            <w:tcW w:type="dxa" w:w="3100"/>
+            <w:tcW w:type="dxa" w:w="3400"/>
             <w:tcMar>
               <w:top w:type="dxa" w:w="40"/>
               <w:left w:type="dxa" w:w="80"/>
@@ -4289,7 +4476,7 @@
         </w:tc>
         <w:tc>
           <w:tcPr>
-            <w:tcW w:type="dxa" w:w="5972"/>
+            <w:tcW w:type="dxa" w:w="5672"/>
             <w:tcMar>
               <w:top w:type="dxa" w:w="40"/>
               <w:left w:type="dxa" w:w="80"/>
@@ -4321,7 +4508,7 @@
         </w:trPr>
         <w:tc>
           <w:tcPr>
-            <w:tcW w:type="dxa" w:w="3100"/>
+            <w:tcW w:type="dxa" w:w="3400"/>
             <w:tcMar>
               <w:top w:type="dxa" w:w="40"/>
               <w:left w:type="dxa" w:w="80"/>
@@ -4348,7 +4535,7 @@
         </w:tc>
         <w:tc>
           <w:tcPr>
-            <w:tcW w:type="dxa" w:w="5972"/>
+            <w:tcW w:type="dxa" w:w="5672"/>
             <w:tcMar>
               <w:top w:type="dxa" w:w="40"/>
               <w:left w:type="dxa" w:w="80"/>
@@ -4380,7 +4567,7 @@
         </w:trPr>
         <w:tc>
           <w:tcPr>
-            <w:tcW w:type="dxa" w:w="3100"/>
+            <w:tcW w:type="dxa" w:w="3400"/>
             <w:tcMar>
               <w:top w:type="dxa" w:w="40"/>
               <w:left w:type="dxa" w:w="80"/>
@@ -4407,7 +4594,7 @@
         </w:tc>
         <w:tc>
           <w:tcPr>
-            <w:tcW w:type="dxa" w:w="5972"/>
+            <w:tcW w:type="dxa" w:w="5672"/>
             <w:tcMar>
               <w:top w:type="dxa" w:w="40"/>
               <w:left w:type="dxa" w:w="80"/>
@@ -4428,7 +4615,7 @@
                 <w:sz w:val="21"/>
                 <w:szCs w:val="21"/>
               </w:rPr>
-              <w:t xml:space="preserve">本地数据显示</w:t>
+              <w:t xml:space="preserve">本地数据显示（I2C）</w:t>
             </w:r>
           </w:p>
         </w:tc>
@@ -4439,34 +4626,34 @@
         </w:trPr>
         <w:tc>
           <w:tcPr>
-            <w:tcW w:type="dxa" w:w="3100"/>
-            <w:tcMar>
-              <w:top w:type="dxa" w:w="40"/>
-              <w:left w:type="dxa" w:w="80"/>
-              <w:bottom w:type="dxa" w:w="40"/>
-              <w:right w:type="dxa" w:w="80"/>
-            </w:tcMar>
-            <w:vAlign w:val="center"/>
-          </w:tcPr>
-          <w:p>
-            <w:pPr>
-              <w:spacing w:after="0" w:line="240"/>
-              <w:jc w:val="center"/>
-            </w:pPr>
-            <w:r>
-              <w:rPr>
-                <w:rFonts w:ascii="Times New Roman" w:cs="Times New Roman" w:eastAsia="SimSun" w:hAnsi="Times New Roman"/>
-                <w:color w:val="000000"/>
-                <w:sz w:val="21"/>
-                <w:szCs w:val="21"/>
-              </w:rPr>
-              <w:t xml:space="preserve">W25Q64 Flash</w:t>
-            </w:r>
-          </w:p>
-        </w:tc>
-        <w:tc>
-          <w:tcPr>
-            <w:tcW w:type="dxa" w:w="5972"/>
+            <w:tcW w:type="dxa" w:w="3400"/>
+            <w:tcMar>
+              <w:top w:type="dxa" w:w="40"/>
+              <w:left w:type="dxa" w:w="80"/>
+              <w:bottom w:type="dxa" w:w="40"/>
+              <w:right w:type="dxa" w:w="80"/>
+            </w:tcMar>
+            <w:vAlign w:val="center"/>
+          </w:tcPr>
+          <w:p>
+            <w:pPr>
+              <w:spacing w:after="0" w:line="240"/>
+              <w:jc w:val="center"/>
+            </w:pPr>
+            <w:r>
+              <w:rPr>
+                <w:rFonts w:ascii="Times New Roman" w:cs="Times New Roman" w:eastAsia="SimSun" w:hAnsi="Times New Roman"/>
+                <w:color w:val="000000"/>
+                <w:sz w:val="21"/>
+                <w:szCs w:val="21"/>
+              </w:rPr>
+              <w:t xml:space="preserve">继电器模块</w:t>
+            </w:r>
+          </w:p>
+        </w:tc>
+        <w:tc>
+          <w:tcPr>
+            <w:tcW w:type="dxa" w:w="5672"/>
             <w:tcMar>
               <w:top w:type="dxa" w:w="40"/>
               <w:left w:type="dxa" w:w="80"/>
@@ -4487,7 +4674,7 @@
                 <w:sz w:val="21"/>
                 <w:szCs w:val="21"/>
               </w:rPr>
-              <w:t xml:space="preserve">数据日志存储（SPI）</w:t>
+              <w:t xml:space="preserve">设备开关控制</w:t>
             </w:r>
           </w:p>
         </w:tc>
@@ -4498,34 +4685,34 @@
         </w:trPr>
         <w:tc>
           <w:tcPr>
-            <w:tcW w:type="dxa" w:w="3100"/>
-            <w:tcMar>
-              <w:top w:type="dxa" w:w="40"/>
-              <w:left w:type="dxa" w:w="80"/>
-              <w:bottom w:type="dxa" w:w="40"/>
-              <w:right w:type="dxa" w:w="80"/>
-            </w:tcMar>
-            <w:vAlign w:val="center"/>
-          </w:tcPr>
-          <w:p>
-            <w:pPr>
-              <w:spacing w:after="0" w:line="240"/>
-              <w:jc w:val="center"/>
-            </w:pPr>
-            <w:r>
-              <w:rPr>
-                <w:rFonts w:ascii="Times New Roman" w:cs="Times New Roman" w:eastAsia="SimSun" w:hAnsi="Times New Roman"/>
-                <w:color w:val="000000"/>
-                <w:sz w:val="21"/>
-                <w:szCs w:val="21"/>
-              </w:rPr>
-              <w:t xml:space="preserve">ESP8266-01S</w:t>
-            </w:r>
-          </w:p>
-        </w:tc>
-        <w:tc>
-          <w:tcPr>
-            <w:tcW w:type="dxa" w:w="5972"/>
+            <w:tcW w:type="dxa" w:w="3400"/>
+            <w:tcMar>
+              <w:top w:type="dxa" w:w="40"/>
+              <w:left w:type="dxa" w:w="80"/>
+              <w:bottom w:type="dxa" w:w="40"/>
+              <w:right w:type="dxa" w:w="80"/>
+            </w:tcMar>
+            <w:vAlign w:val="center"/>
+          </w:tcPr>
+          <w:p>
+            <w:pPr>
+              <w:spacing w:after="0" w:line="240"/>
+              <w:jc w:val="center"/>
+            </w:pPr>
+            <w:r>
+              <w:rPr>
+                <w:rFonts w:ascii="Times New Roman" w:cs="Times New Roman" w:eastAsia="SimSun" w:hAnsi="Times New Roman"/>
+                <w:color w:val="000000"/>
+                <w:sz w:val="21"/>
+                <w:szCs w:val="21"/>
+              </w:rPr>
+              <w:t xml:space="preserve">水泵</w:t>
+            </w:r>
+          </w:p>
+        </w:tc>
+        <w:tc>
+          <w:tcPr>
+            <w:tcW w:type="dxa" w:w="5672"/>
             <w:tcMar>
               <w:top w:type="dxa" w:w="40"/>
               <w:left w:type="dxa" w:w="80"/>
@@ -4546,7 +4733,7 @@
                 <w:sz w:val="21"/>
                 <w:szCs w:val="21"/>
               </w:rPr>
-              <w:t xml:space="preserve">Wi-Fi 上云（AT/MQTT）</w:t>
+              <w:t xml:space="preserve">浇水</w:t>
             </w:r>
           </w:p>
         </w:tc>
@@ -4557,34 +4744,34 @@
         </w:trPr>
         <w:tc>
           <w:tcPr>
-            <w:tcW w:type="dxa" w:w="3100"/>
-            <w:tcMar>
-              <w:top w:type="dxa" w:w="40"/>
-              <w:left w:type="dxa" w:w="80"/>
-              <w:bottom w:type="dxa" w:w="40"/>
-              <w:right w:type="dxa" w:w="80"/>
-            </w:tcMar>
-            <w:vAlign w:val="center"/>
-          </w:tcPr>
-          <w:p>
-            <w:pPr>
-              <w:spacing w:after="0" w:line="240"/>
-              <w:jc w:val="center"/>
-            </w:pPr>
-            <w:r>
-              <w:rPr>
-                <w:rFonts w:ascii="Times New Roman" w:cs="Times New Roman" w:eastAsia="SimSun" w:hAnsi="Times New Roman"/>
-                <w:color w:val="000000"/>
-                <w:sz w:val="21"/>
-                <w:szCs w:val="21"/>
-              </w:rPr>
-              <w:t xml:space="preserve">ESP32-CAM</w:t>
-            </w:r>
-          </w:p>
-        </w:tc>
-        <w:tc>
-          <w:tcPr>
-            <w:tcW w:type="dxa" w:w="5972"/>
+            <w:tcW w:type="dxa" w:w="3400"/>
+            <w:tcMar>
+              <w:top w:type="dxa" w:w="40"/>
+              <w:left w:type="dxa" w:w="80"/>
+              <w:bottom w:type="dxa" w:w="40"/>
+              <w:right w:type="dxa" w:w="80"/>
+            </w:tcMar>
+            <w:vAlign w:val="center"/>
+          </w:tcPr>
+          <w:p>
+            <w:pPr>
+              <w:spacing w:after="0" w:line="240"/>
+              <w:jc w:val="center"/>
+            </w:pPr>
+            <w:r>
+              <w:rPr>
+                <w:rFonts w:ascii="Times New Roman" w:cs="Times New Roman" w:eastAsia="SimSun" w:hAnsi="Times New Roman"/>
+                <w:color w:val="000000"/>
+                <w:sz w:val="21"/>
+                <w:szCs w:val="21"/>
+              </w:rPr>
+              <w:t xml:space="preserve">蠕动泵</w:t>
+            </w:r>
+          </w:p>
+        </w:tc>
+        <w:tc>
+          <w:tcPr>
+            <w:tcW w:type="dxa" w:w="5672"/>
             <w:tcMar>
               <w:top w:type="dxa" w:w="40"/>
               <w:left w:type="dxa" w:w="80"/>
@@ -4605,7 +4792,7 @@
                 <w:sz w:val="21"/>
                 <w:szCs w:val="21"/>
               </w:rPr>
-              <w:t xml:space="preserve">病害/生长拍照与轻量识别</w:t>
+              <w:t xml:space="preserve">施肥/给药</w:t>
             </w:r>
           </w:p>
         </w:tc>
@@ -4616,34 +4803,34 @@
         </w:trPr>
         <w:tc>
           <w:tcPr>
-            <w:tcW w:type="dxa" w:w="3100"/>
-            <w:tcMar>
-              <w:top w:type="dxa" w:w="40"/>
-              <w:left w:type="dxa" w:w="80"/>
-              <w:bottom w:type="dxa" w:w="40"/>
-              <w:right w:type="dxa" w:w="80"/>
-            </w:tcMar>
-            <w:vAlign w:val="center"/>
-          </w:tcPr>
-          <w:p>
-            <w:pPr>
-              <w:spacing w:after="0" w:line="240"/>
-              <w:jc w:val="center"/>
-            </w:pPr>
-            <w:r>
-              <w:rPr>
-                <w:rFonts w:ascii="Times New Roman" w:cs="Times New Roman" w:eastAsia="SimSun" w:hAnsi="Times New Roman"/>
-                <w:color w:val="000000"/>
-                <w:sz w:val="21"/>
-                <w:szCs w:val="21"/>
-              </w:rPr>
-              <w:t xml:space="preserve">继电器模块</w:t>
-            </w:r>
-          </w:p>
-        </w:tc>
-        <w:tc>
-          <w:tcPr>
-            <w:tcW w:type="dxa" w:w="5972"/>
+            <w:tcW w:type="dxa" w:w="3400"/>
+            <w:tcMar>
+              <w:top w:type="dxa" w:w="40"/>
+              <w:left w:type="dxa" w:w="80"/>
+              <w:bottom w:type="dxa" w:w="40"/>
+              <w:right w:type="dxa" w:w="80"/>
+            </w:tcMar>
+            <w:vAlign w:val="center"/>
+          </w:tcPr>
+          <w:p>
+            <w:pPr>
+              <w:spacing w:after="0" w:line="240"/>
+              <w:jc w:val="center"/>
+            </w:pPr>
+            <w:r>
+              <w:rPr>
+                <w:rFonts w:ascii="Times New Roman" w:cs="Times New Roman" w:eastAsia="SimSun" w:hAnsi="Times New Roman"/>
+                <w:color w:val="000000"/>
+                <w:sz w:val="21"/>
+                <w:szCs w:val="21"/>
+              </w:rPr>
+              <w:t xml:space="preserve">风扇</w:t>
+            </w:r>
+          </w:p>
+        </w:tc>
+        <w:tc>
+          <w:tcPr>
+            <w:tcW w:type="dxa" w:w="5672"/>
             <w:tcMar>
               <w:top w:type="dxa" w:w="40"/>
               <w:left w:type="dxa" w:w="80"/>
@@ -4664,7 +4851,7 @@
                 <w:sz w:val="21"/>
                 <w:szCs w:val="21"/>
               </w:rPr>
-              <w:t xml:space="preserve">设备开关控制</w:t>
+              <w:t xml:space="preserve">通风降温</w:t>
             </w:r>
           </w:p>
         </w:tc>
@@ -4675,34 +4862,34 @@
         </w:trPr>
         <w:tc>
           <w:tcPr>
-            <w:tcW w:type="dxa" w:w="3100"/>
-            <w:tcMar>
-              <w:top w:type="dxa" w:w="40"/>
-              <w:left w:type="dxa" w:w="80"/>
-              <w:bottom w:type="dxa" w:w="40"/>
-              <w:right w:type="dxa" w:w="80"/>
-            </w:tcMar>
-            <w:vAlign w:val="center"/>
-          </w:tcPr>
-          <w:p>
-            <w:pPr>
-              <w:spacing w:after="0" w:line="240"/>
-              <w:jc w:val="center"/>
-            </w:pPr>
-            <w:r>
-              <w:rPr>
-                <w:rFonts w:ascii="Times New Roman" w:cs="Times New Roman" w:eastAsia="SimSun" w:hAnsi="Times New Roman"/>
-                <w:color w:val="000000"/>
-                <w:sz w:val="21"/>
-                <w:szCs w:val="21"/>
-              </w:rPr>
-              <w:t xml:space="preserve">水泵</w:t>
-            </w:r>
-          </w:p>
-        </w:tc>
-        <w:tc>
-          <w:tcPr>
-            <w:tcW w:type="dxa" w:w="5972"/>
+            <w:tcW w:type="dxa" w:w="3400"/>
+            <w:tcMar>
+              <w:top w:type="dxa" w:w="40"/>
+              <w:left w:type="dxa" w:w="80"/>
+              <w:bottom w:type="dxa" w:w="40"/>
+              <w:right w:type="dxa" w:w="80"/>
+            </w:tcMar>
+            <w:vAlign w:val="center"/>
+          </w:tcPr>
+          <w:p>
+            <w:pPr>
+              <w:spacing w:after="0" w:line="240"/>
+              <w:jc w:val="center"/>
+            </w:pPr>
+            <w:r>
+              <w:rPr>
+                <w:rFonts w:ascii="Times New Roman" w:cs="Times New Roman" w:eastAsia="SimSun" w:hAnsi="Times New Roman"/>
+                <w:color w:val="000000"/>
+                <w:sz w:val="21"/>
+                <w:szCs w:val="21"/>
+              </w:rPr>
+              <w:t xml:space="preserve">加热片</w:t>
+            </w:r>
+          </w:p>
+        </w:tc>
+        <w:tc>
+          <w:tcPr>
+            <w:tcW w:type="dxa" w:w="5672"/>
             <w:tcMar>
               <w:top w:type="dxa" w:w="40"/>
               <w:left w:type="dxa" w:w="80"/>
@@ -4723,7 +4910,7 @@
                 <w:sz w:val="21"/>
                 <w:szCs w:val="21"/>
               </w:rPr>
-              <w:t xml:space="preserve">浇水</w:t>
+              <w:t xml:space="preserve">低温补偿</w:t>
             </w:r>
           </w:p>
         </w:tc>
@@ -4734,34 +4921,34 @@
         </w:trPr>
         <w:tc>
           <w:tcPr>
-            <w:tcW w:type="dxa" w:w="3100"/>
-            <w:tcMar>
-              <w:top w:type="dxa" w:w="40"/>
-              <w:left w:type="dxa" w:w="80"/>
-              <w:bottom w:type="dxa" w:w="40"/>
-              <w:right w:type="dxa" w:w="80"/>
-            </w:tcMar>
-            <w:vAlign w:val="center"/>
-          </w:tcPr>
-          <w:p>
-            <w:pPr>
-              <w:spacing w:after="0" w:line="240"/>
-              <w:jc w:val="center"/>
-            </w:pPr>
-            <w:r>
-              <w:rPr>
-                <w:rFonts w:ascii="Times New Roman" w:cs="Times New Roman" w:eastAsia="SimSun" w:hAnsi="Times New Roman"/>
-                <w:color w:val="000000"/>
-                <w:sz w:val="21"/>
-                <w:szCs w:val="21"/>
-              </w:rPr>
-              <w:t xml:space="preserve">蠕动泵</w:t>
-            </w:r>
-          </w:p>
-        </w:tc>
-        <w:tc>
-          <w:tcPr>
-            <w:tcW w:type="dxa" w:w="5972"/>
+            <w:tcW w:type="dxa" w:w="3400"/>
+            <w:tcMar>
+              <w:top w:type="dxa" w:w="40"/>
+              <w:left w:type="dxa" w:w="80"/>
+              <w:bottom w:type="dxa" w:w="40"/>
+              <w:right w:type="dxa" w:w="80"/>
+            </w:tcMar>
+            <w:vAlign w:val="center"/>
+          </w:tcPr>
+          <w:p>
+            <w:pPr>
+              <w:spacing w:after="0" w:line="240"/>
+              <w:jc w:val="center"/>
+            </w:pPr>
+            <w:r>
+              <w:rPr>
+                <w:rFonts w:ascii="Times New Roman" w:cs="Times New Roman" w:eastAsia="SimSun" w:hAnsi="Times New Roman"/>
+                <w:color w:val="000000"/>
+                <w:sz w:val="21"/>
+                <w:szCs w:val="21"/>
+              </w:rPr>
+              <w:t xml:space="preserve">补光灯</w:t>
+            </w:r>
+          </w:p>
+        </w:tc>
+        <w:tc>
+          <w:tcPr>
+            <w:tcW w:type="dxa" w:w="5672"/>
             <w:tcMar>
               <w:top w:type="dxa" w:w="40"/>
               <w:left w:type="dxa" w:w="80"/>
@@ -4782,7 +4969,7 @@
                 <w:sz w:val="21"/>
                 <w:szCs w:val="21"/>
               </w:rPr>
-              <w:t xml:space="preserve">施肥/给药</w:t>
+              <w:t xml:space="preserve">光照补充（PWM 调光）</w:t>
             </w:r>
           </w:p>
         </w:tc>
@@ -4793,34 +4980,34 @@
         </w:trPr>
         <w:tc>
           <w:tcPr>
-            <w:tcW w:type="dxa" w:w="3100"/>
-            <w:tcMar>
-              <w:top w:type="dxa" w:w="40"/>
-              <w:left w:type="dxa" w:w="80"/>
-              <w:bottom w:type="dxa" w:w="40"/>
-              <w:right w:type="dxa" w:w="80"/>
-            </w:tcMar>
-            <w:vAlign w:val="center"/>
-          </w:tcPr>
-          <w:p>
-            <w:pPr>
-              <w:spacing w:after="0" w:line="240"/>
-              <w:jc w:val="center"/>
-            </w:pPr>
-            <w:r>
-              <w:rPr>
-                <w:rFonts w:ascii="Times New Roman" w:cs="Times New Roman" w:eastAsia="SimSun" w:hAnsi="Times New Roman"/>
-                <w:color w:val="000000"/>
-                <w:sz w:val="21"/>
-                <w:szCs w:val="21"/>
-              </w:rPr>
-              <w:t xml:space="preserve">风扇</w:t>
-            </w:r>
-          </w:p>
-        </w:tc>
-        <w:tc>
-          <w:tcPr>
-            <w:tcW w:type="dxa" w:w="5972"/>
+            <w:tcW w:type="dxa" w:w="3400"/>
+            <w:tcMar>
+              <w:top w:type="dxa" w:w="40"/>
+              <w:left w:type="dxa" w:w="80"/>
+              <w:bottom w:type="dxa" w:w="40"/>
+              <w:right w:type="dxa" w:w="80"/>
+            </w:tcMar>
+            <w:vAlign w:val="center"/>
+          </w:tcPr>
+          <w:p>
+            <w:pPr>
+              <w:spacing w:after="0" w:line="240"/>
+              <w:jc w:val="center"/>
+            </w:pPr>
+            <w:r>
+              <w:rPr>
+                <w:rFonts w:ascii="Times New Roman" w:cs="Times New Roman" w:eastAsia="SimSun" w:hAnsi="Times New Roman"/>
+                <w:color w:val="000000"/>
+                <w:sz w:val="21"/>
+                <w:szCs w:val="21"/>
+              </w:rPr>
+              <w:t xml:space="preserve">舵机 ×2（可选）</w:t>
+            </w:r>
+          </w:p>
+        </w:tc>
+        <w:tc>
+          <w:tcPr>
+            <w:tcW w:type="dxa" w:w="5672"/>
             <w:tcMar>
               <w:top w:type="dxa" w:w="40"/>
               <w:left w:type="dxa" w:w="80"/>
@@ -4841,7 +5028,7 @@
                 <w:sz w:val="21"/>
                 <w:szCs w:val="21"/>
               </w:rPr>
-              <w:t xml:space="preserve">通风降温</w:t>
+              <w:t xml:space="preserve">喷药两轴云台</w:t>
             </w:r>
           </w:p>
         </w:tc>
@@ -4852,34 +5039,34 @@
         </w:trPr>
         <w:tc>
           <w:tcPr>
-            <w:tcW w:type="dxa" w:w="3100"/>
-            <w:tcMar>
-              <w:top w:type="dxa" w:w="40"/>
-              <w:left w:type="dxa" w:w="80"/>
-              <w:bottom w:type="dxa" w:w="40"/>
-              <w:right w:type="dxa" w:w="80"/>
-            </w:tcMar>
-            <w:vAlign w:val="center"/>
-          </w:tcPr>
-          <w:p>
-            <w:pPr>
-              <w:spacing w:after="0" w:line="240"/>
-              <w:jc w:val="center"/>
-            </w:pPr>
-            <w:r>
-              <w:rPr>
-                <w:rFonts w:ascii="Times New Roman" w:cs="Times New Roman" w:eastAsia="SimSun" w:hAnsi="Times New Roman"/>
-                <w:color w:val="000000"/>
-                <w:sz w:val="21"/>
-                <w:szCs w:val="21"/>
-              </w:rPr>
-              <w:t xml:space="preserve">加热片</w:t>
-            </w:r>
-          </w:p>
-        </w:tc>
-        <w:tc>
-          <w:tcPr>
-            <w:tcW w:type="dxa" w:w="5972"/>
+            <w:tcW w:type="dxa" w:w="3400"/>
+            <w:tcMar>
+              <w:top w:type="dxa" w:w="40"/>
+              <w:left w:type="dxa" w:w="80"/>
+              <w:bottom w:type="dxa" w:w="40"/>
+              <w:right w:type="dxa" w:w="80"/>
+            </w:tcMar>
+            <w:vAlign w:val="center"/>
+          </w:tcPr>
+          <w:p>
+            <w:pPr>
+              <w:spacing w:after="0" w:line="240"/>
+              <w:jc w:val="center"/>
+            </w:pPr>
+            <w:r>
+              <w:rPr>
+                <w:rFonts w:ascii="Times New Roman" w:cs="Times New Roman" w:eastAsia="SimSun" w:hAnsi="Times New Roman"/>
+                <w:color w:val="000000"/>
+                <w:sz w:val="21"/>
+                <w:szCs w:val="21"/>
+              </w:rPr>
+              <w:t xml:space="preserve">5V 稳压供电模块</w:t>
+            </w:r>
+          </w:p>
+        </w:tc>
+        <w:tc>
+          <w:tcPr>
+            <w:tcW w:type="dxa" w:w="5672"/>
             <w:tcMar>
               <w:top w:type="dxa" w:w="40"/>
               <w:left w:type="dxa" w:w="80"/>
@@ -4900,7 +5087,7 @@
                 <w:sz w:val="21"/>
                 <w:szCs w:val="21"/>
               </w:rPr>
-              <w:t xml:space="preserve">低温补偿</w:t>
+              <w:t xml:space="preserve">ESP32-CAM 稳定供电（电流敏感）</w:t>
             </w:r>
           </w:p>
         </w:tc>
@@ -4911,34 +5098,34 @@
         </w:trPr>
         <w:tc>
           <w:tcPr>
-            <w:tcW w:type="dxa" w:w="3100"/>
-            <w:tcMar>
-              <w:top w:type="dxa" w:w="40"/>
-              <w:left w:type="dxa" w:w="80"/>
-              <w:bottom w:type="dxa" w:w="40"/>
-              <w:right w:type="dxa" w:w="80"/>
-            </w:tcMar>
-            <w:vAlign w:val="center"/>
-          </w:tcPr>
-          <w:p>
-            <w:pPr>
-              <w:spacing w:after="0" w:line="240"/>
-              <w:jc w:val="center"/>
-            </w:pPr>
-            <w:r>
-              <w:rPr>
-                <w:rFonts w:ascii="Times New Roman" w:cs="Times New Roman" w:eastAsia="SimSun" w:hAnsi="Times New Roman"/>
-                <w:color w:val="000000"/>
-                <w:sz w:val="21"/>
-                <w:szCs w:val="21"/>
-              </w:rPr>
-              <w:t xml:space="preserve">补光灯</w:t>
-            </w:r>
-          </w:p>
-        </w:tc>
-        <w:tc>
-          <w:tcPr>
-            <w:tcW w:type="dxa" w:w="5972"/>
+            <w:tcW w:type="dxa" w:w="3400"/>
+            <w:tcMar>
+              <w:top w:type="dxa" w:w="40"/>
+              <w:left w:type="dxa" w:w="80"/>
+              <w:bottom w:type="dxa" w:w="40"/>
+              <w:right w:type="dxa" w:w="80"/>
+            </w:tcMar>
+            <w:vAlign w:val="center"/>
+          </w:tcPr>
+          <w:p>
+            <w:pPr>
+              <w:spacing w:after="0" w:line="240"/>
+              <w:jc w:val="center"/>
+            </w:pPr>
+            <w:r>
+              <w:rPr>
+                <w:rFonts w:ascii="Times New Roman" w:cs="Times New Roman" w:eastAsia="SimSun" w:hAnsi="Times New Roman"/>
+                <w:color w:val="000000"/>
+                <w:sz w:val="21"/>
+                <w:szCs w:val="21"/>
+              </w:rPr>
+              <w:t xml:space="preserve">USB 转串口模块（可选）</w:t>
+            </w:r>
+          </w:p>
+        </w:tc>
+        <w:tc>
+          <w:tcPr>
+            <w:tcW w:type="dxa" w:w="5672"/>
             <w:tcMar>
               <w:top w:type="dxa" w:w="40"/>
               <w:left w:type="dxa" w:w="80"/>
@@ -4959,7 +5146,7 @@
                 <w:sz w:val="21"/>
                 <w:szCs w:val="21"/>
               </w:rPr>
-              <w:t xml:space="preserve">光照补充（PWM 调光）</w:t>
+              <w:t xml:space="preserve">ESP32-CAM 烧录与调试（板载无 USB）</w:t>
             </w:r>
           </w:p>
         </w:tc>
@@ -4970,34 +5157,34 @@
         </w:trPr>
         <w:tc>
           <w:tcPr>
-            <w:tcW w:type="dxa" w:w="3100"/>
-            <w:tcMar>
-              <w:top w:type="dxa" w:w="40"/>
-              <w:left w:type="dxa" w:w="80"/>
-              <w:bottom w:type="dxa" w:w="40"/>
-              <w:right w:type="dxa" w:w="80"/>
-            </w:tcMar>
-            <w:vAlign w:val="center"/>
-          </w:tcPr>
-          <w:p>
-            <w:pPr>
-              <w:spacing w:after="0" w:line="240"/>
-              <w:jc w:val="center"/>
-            </w:pPr>
-            <w:r>
-              <w:rPr>
-                <w:rFonts w:ascii="Times New Roman" w:cs="Times New Roman" w:eastAsia="SimSun" w:hAnsi="Times New Roman"/>
-                <w:color w:val="000000"/>
-                <w:sz w:val="21"/>
-                <w:szCs w:val="21"/>
-              </w:rPr>
-              <w:t xml:space="preserve">舵机 ×2（可选）</w:t>
-            </w:r>
-          </w:p>
-        </w:tc>
-        <w:tc>
-          <w:tcPr>
-            <w:tcW w:type="dxa" w:w="5972"/>
+            <w:tcW w:type="dxa" w:w="3400"/>
+            <w:tcMar>
+              <w:top w:type="dxa" w:w="40"/>
+              <w:left w:type="dxa" w:w="80"/>
+              <w:bottom w:type="dxa" w:w="40"/>
+              <w:right w:type="dxa" w:w="80"/>
+            </w:tcMar>
+            <w:vAlign w:val="center"/>
+          </w:tcPr>
+          <w:p>
+            <w:pPr>
+              <w:spacing w:after="0" w:line="240"/>
+              <w:jc w:val="center"/>
+            </w:pPr>
+            <w:r>
+              <w:rPr>
+                <w:rFonts w:ascii="Times New Roman" w:cs="Times New Roman" w:eastAsia="SimSun" w:hAnsi="Times New Roman"/>
+                <w:color w:val="000000"/>
+                <w:sz w:val="21"/>
+                <w:szCs w:val="21"/>
+              </w:rPr>
+              <w:t xml:space="preserve">microSD 卡</w:t>
+            </w:r>
+          </w:p>
+        </w:tc>
+        <w:tc>
+          <w:tcPr>
+            <w:tcW w:type="dxa" w:w="5672"/>
             <w:tcMar>
               <w:top w:type="dxa" w:w="40"/>
               <w:left w:type="dxa" w:w="80"/>
@@ -5018,7 +5205,7 @@
                 <w:sz w:val="21"/>
                 <w:szCs w:val="21"/>
               </w:rPr>
-              <w:t xml:space="preserve">喷药两轴云台</w:t>
+              <w:t xml:space="preserve">断网本地日志存储</w:t>
             </w:r>
           </w:p>
         </w:tc>
@@ -5269,7 +5456,7 @@
                 <w:sz w:val="21"/>
                 <w:szCs w:val="21"/>
               </w:rPr>
-              <w:t xml:space="preserve">链路定稿、软件环境搭建（Python/Dify/YOLO）</w:t>
+              <w:t xml:space="preserve">链路定稿（ESP32 + Node.js + Vue）、软件环境搭建</w:t>
             </w:r>
           </w:p>
         </w:tc>
@@ -5382,7 +5569,7 @@
                 <w:sz w:val="21"/>
                 <w:szCs w:val="21"/>
               </w:rPr>
-              <w:t xml:space="preserve">传感器采集→OLED→继电器→串口帧协议→LabVIEW 上位机</w:t>
+              <w:t xml:space="preserve">ESP32 传感器采集→OLED→继电器→MQTT（本地 EMQX）→Node.js→Vue 控制页</w:t>
             </w:r>
           </w:p>
         </w:tc>
@@ -5409,7 +5596,7 @@
                 <w:sz w:val="21"/>
                 <w:szCs w:val="21"/>
               </w:rPr>
-              <w:t xml:space="preserve">本地闭环运行，数据帧正确，远程手动可控</w:t>
+              <w:t xml:space="preserve">局域网内数据正确、远程手动可控</w:t>
             </w:r>
           </w:p>
         </w:tc>
@@ -5441,7 +5628,7 @@
                 <w:sz w:val="21"/>
                 <w:szCs w:val="21"/>
               </w:rPr>
-              <w:t xml:space="preserve">M2 上云+日志</w:t>
+              <w:t xml:space="preserve">M2 上云+拍照+日志</w:t>
             </w:r>
           </w:p>
         </w:tc>
@@ -5495,7 +5682,7 @@
                 <w:sz w:val="21"/>
                 <w:szCs w:val="21"/>
               </w:rPr>
-              <w:t xml:space="preserve">ESP8266 MQTT→EMQX/OneNET→Node-RED 可视化；W25Q64 日志</w:t>
+              <w:t xml:space="preserve">ESP32-CAM 定时拍照上传；MQTT 上云；Node.js 时序存储+Vue 大屏；microSD 断网补传</w:t>
             </w:r>
           </w:p>
         </w:tc>
@@ -5522,7 +5709,7 @@
                 <w:sz w:val="21"/>
                 <w:szCs w:val="21"/>
               </w:rPr>
-              <w:t xml:space="preserve">云平台实时曲线、断网日志完整可补传</w:t>
+              <w:t xml:space="preserve">云平台实时曲线、图片可查、断网日志完整可补传</w:t>
             </w:r>
           </w:p>
         </w:tc>
@@ -5608,7 +5795,7 @@
                 <w:sz w:val="21"/>
                 <w:szCs w:val="21"/>
               </w:rPr>
-              <w:t xml:space="preserve">公开集+自采数据训练 YOLO（先 5 类常见病）→云端推理→触发喷药</w:t>
+              <w:t xml:space="preserve">公开集+自采数据训练 YOLO（先 5 类常见病）→Node.js 调视觉服务→触发喷药</w:t>
             </w:r>
           </w:p>
         </w:tc>
@@ -5721,7 +5908,7 @@
                 <w:sz w:val="21"/>
                 <w:szCs w:val="21"/>
               </w:rPr>
-              <w:t xml:space="preserve">Dify 搭智能体+RAG 知识库→综合决策→指令闭环→小程序</w:t>
+              <w:t xml:space="preserve">Node.js 编排智能体+RAG 知识库（设备决策+农技问答）→ JSON 指令闭环 → Vue 对话</w:t>
             </w:r>
           </w:p>
         </w:tc>
@@ -5748,7 +5935,7 @@
                 <w:sz w:val="21"/>
                 <w:szCs w:val="21"/>
               </w:rPr>
-              <w:t xml:space="preserve">自然语言指令自动执行，误操作有兜底</w:t>
+              <w:t xml:space="preserve">自然语言指令自动执行，农技问答可溯源，误操作有兜底</w:t>
             </w:r>
           </w:p>
         </w:tc>
@@ -5965,7 +6152,7 @@
           <w:sz w:val="24"/>
           <w:szCs w:val="24"/>
         </w:rPr>
-        <w:t xml:space="preserve">低成本：</w:t>
+        <w:t xml:space="preserve">低成本单芯片：</w:t>
       </w:r>
       <w:r>
         <w:rPr>
@@ -5974,7 +6161,7 @@
           <w:sz w:val="24"/>
           <w:szCs w:val="24"/>
         </w:rPr>
-        <w:t xml:space="preserve">硬件总成本低，农户可负担，便于推广。</w:t>
+        <w:t xml:space="preserve">ESP32 单芯片完成采集、拍照、控制与联网，链路最短、硬件成本低，整套闭环可复现，适合竞赛展示与教学科研场景推广。</w:t>
       </w:r>
     </w:p>
     <w:p>
@@ -6210,7 +6397,7 @@
                 <w:sz w:val="21"/>
                 <w:szCs w:val="21"/>
               </w:rPr>
-              <w:t xml:space="preserve">ESP32-CAM 边缘算力不足</w:t>
+              <w:t xml:space="preserve">ESP32-CAM 算力不足</w:t>
             </w:r>
           </w:p>
         </w:tc>
@@ -6269,7 +6456,7 @@
                 <w:sz w:val="21"/>
                 <w:szCs w:val="21"/>
               </w:rPr>
-              <w:t xml:space="preserve">司农本地部署显存要求高</w:t>
+              <w:t xml:space="preserve">ESP32-CAM 引脚少/供电敏感</w:t>
             </w:r>
           </w:p>
         </w:tc>
@@ -6296,7 +6483,7 @@
                 <w:sz w:val="21"/>
                 <w:szCs w:val="21"/>
               </w:rPr>
-              <w:t xml:space="preserve">先用 8B 或 DeepSeek API（现有），作品后期再本地化</w:t>
+              <w:t xml:space="preserve">稳压供电；继电器组用 I/O 扩展（如 PCF8574/74HC595）或精简执行器数量</w:t>
             </w:r>
           </w:p>
         </w:tc>
@@ -6387,7 +6574,7 @@
                 <w:sz w:val="21"/>
                 <w:szCs w:val="21"/>
               </w:rPr>
-              <w:t xml:space="preserve">网络不稳定</w:t>
+              <w:t xml:space="preserve">Wi-Fi 不稳定</w:t>
             </w:r>
           </w:p>
         </w:tc>
@@ -6414,7 +6601,7 @@
                 <w:sz w:val="21"/>
                 <w:szCs w:val="21"/>
               </w:rPr>
-              <w:t xml:space="preserve">本地阈值模式 + W25Q64 日志补传</w:t>
+              <w:t xml:space="preserve">本地阈值模式 + microSD 日志补传</w:t>
             </w:r>
           </w:p>
         </w:tc>
@@ -6473,7 +6660,7 @@
                 <w:sz w:val="21"/>
                 <w:szCs w:val="21"/>
               </w:rPr>
-              <w:t xml:space="preserve">裁剪顺序：合并施肥/给药、生长分析降级为拍照+周报、小程序用农业岛二开</w:t>
+              <w:t xml:space="preserve">裁剪顺序：合并施肥/给药、生长分析降级为拍照+周报、Vue 先做单页大屏</w:t>
             </w:r>
           </w:p>
         </w:tc>
@@ -6606,7 +6793,7 @@
                 <w:sz w:val="21"/>
                 <w:szCs w:val="21"/>
               </w:rPr>
-              <w:t xml:space="preserve">I2C（进行中）</w:t>
+              <w:t xml:space="preserve">I2C（已学）</w:t>
             </w:r>
           </w:p>
         </w:tc>
@@ -6633,7 +6820,7 @@
                 <w:sz w:val="21"/>
                 <w:szCs w:val="21"/>
               </w:rPr>
-              <w:t xml:space="preserve">BH1750 光照驱动（修复 SmartAgriculture 推挽 bug）</w:t>
+              <w:t xml:space="preserve">BH1750/OLED 驱动迁移到 ESP32</w:t>
             </w:r>
           </w:p>
         </w:tc>
@@ -6665,7 +6852,7 @@
                 <w:sz w:val="21"/>
                 <w:szCs w:val="21"/>
               </w:rPr>
-              <w:t xml:space="preserve">SPI（进行中）</w:t>
+              <w:t xml:space="preserve">SPI / 串口（已学）</w:t>
             </w:r>
           </w:p>
         </w:tc>
@@ -6692,7 +6879,7 @@
                 <w:sz w:val="21"/>
                 <w:szCs w:val="21"/>
               </w:rPr>
-              <w:t xml:space="preserve">W25Q64 数据日志</w:t>
+              <w:t xml:space="preserve">microSD 卡日志、调试串口；数据帧设计迁移到 MQTT JSON</w:t>
             </w:r>
           </w:p>
         </w:tc>
@@ -6724,7 +6911,7 @@
                 <w:sz w:val="21"/>
                 <w:szCs w:val="21"/>
               </w:rPr>
-              <w:t xml:space="preserve">DMA + 串口文本包</w:t>
+              <w:t xml:space="preserve">定时器 PWM（已学）</w:t>
             </w:r>
           </w:p>
         </w:tc>
@@ -6751,7 +6938,7 @@
                 <w:sz w:val="21"/>
                 <w:szCs w:val="21"/>
               </w:rPr>
-              <w:t xml:space="preserve">数据帧收发、DMA 不定长接收</w:t>
+              <w:t xml:space="preserve">补光灯调光、风扇调速</w:t>
             </w:r>
           </w:p>
         </w:tc>
@@ -6783,7 +6970,7 @@
                 <w:sz w:val="21"/>
                 <w:szCs w:val="21"/>
               </w:rPr>
-              <w:t xml:space="preserve">定时器 PWM / PID</w:t>
+              <w:t xml:space="preserve">新增：ESP32（Arduino/ESP-IDF）</w:t>
             </w:r>
           </w:p>
         </w:tc>
@@ -6810,7 +6997,7 @@
                 <w:sz w:val="21"/>
                 <w:szCs w:val="21"/>
               </w:rPr>
-              <w:t xml:space="preserve">补光灯调光、温控、泵流量调节</w:t>
+              <w:t xml:space="preserve">感知执行端固件（采集/拍照/控制/本地规则）</w:t>
             </w:r>
           </w:p>
         </w:tc>
@@ -6842,7 +7029,7 @@
                 <w:sz w:val="21"/>
                 <w:szCs w:val="21"/>
               </w:rPr>
-              <w:t xml:space="preserve">LabVIEW UDP/TCP</w:t>
+              <w:t xml:space="preserve">新增：Wi-Fi/MQTT</w:t>
             </w:r>
           </w:p>
         </w:tc>
@@ -6869,7 +7056,7 @@
                 <w:sz w:val="21"/>
                 <w:szCs w:val="21"/>
               </w:rPr>
-              <w:t xml:space="preserve">本地调试上位机（AA55 协议）</w:t>
+              <w:t xml:space="preserve">设备上云通道（MQTT JSON + HTTP 图片）</w:t>
             </w:r>
           </w:p>
         </w:tc>
@@ -6901,7 +7088,7 @@
                 <w:sz w:val="21"/>
                 <w:szCs w:val="21"/>
               </w:rPr>
-              <w:t xml:space="preserve">新增：Python/OpenCV/YOLO</w:t>
+              <w:t xml:space="preserve">新增：Node.js（Express/mqtt.js/WebSocket）</w:t>
             </w:r>
           </w:p>
         </w:tc>
@@ -6928,7 +7115,7 @@
                 <w:sz w:val="21"/>
                 <w:szCs w:val="21"/>
               </w:rPr>
-              <w:t xml:space="preserve">病害检测、生长分析</w:t>
+              <w:t xml:space="preserve">云端平台后端</w:t>
             </w:r>
           </w:p>
         </w:tc>
@@ -6960,7 +7147,7 @@
                 <w:sz w:val="21"/>
                 <w:szCs w:val="21"/>
               </w:rPr>
-              <w:t xml:space="preserve">新增：Dify/Coze + RAG</w:t>
+              <w:t xml:space="preserve">新增：Vue 3 + ECharts</w:t>
             </w:r>
           </w:p>
         </w:tc>
@@ -6987,7 +7174,66 @@
                 <w:sz w:val="21"/>
                 <w:szCs w:val="21"/>
               </w:rPr>
-              <w:t xml:space="preserve">智能体决策层</w:t>
+              <w:t xml:space="preserve">前端大屏/控制页/问答</w:t>
+            </w:r>
+          </w:p>
+        </w:tc>
+      </w:tr>
+      <w:tr>
+        <w:trPr>
+          <w:tblHeader w:val="false"/>
+        </w:trPr>
+        <w:tc>
+          <w:tcPr>
+            <w:tcW w:type="dxa" w:w="3900"/>
+            <w:tcMar>
+              <w:top w:type="dxa" w:w="40"/>
+              <w:left w:type="dxa" w:w="80"/>
+              <w:bottom w:type="dxa" w:w="40"/>
+              <w:right w:type="dxa" w:w="80"/>
+            </w:tcMar>
+            <w:vAlign w:val="center"/>
+          </w:tcPr>
+          <w:p>
+            <w:pPr>
+              <w:spacing w:after="0" w:line="240"/>
+              <w:jc w:val="center"/>
+            </w:pPr>
+            <w:r>
+              <w:rPr>
+                <w:rFonts w:ascii="Times New Roman" w:cs="Times New Roman" w:eastAsia="SimSun" w:hAnsi="Times New Roman"/>
+                <w:color w:val="000000"/>
+                <w:sz w:val="21"/>
+                <w:szCs w:val="21"/>
+              </w:rPr>
+              <w:t xml:space="preserve">新增：Python/OpenCV/YOLO</w:t>
+            </w:r>
+          </w:p>
+        </w:tc>
+        <w:tc>
+          <w:tcPr>
+            <w:tcW w:type="dxa" w:w="5172"/>
+            <w:tcMar>
+              <w:top w:type="dxa" w:w="40"/>
+              <w:left w:type="dxa" w:w="80"/>
+              <w:bottom w:type="dxa" w:w="40"/>
+              <w:right w:type="dxa" w:w="80"/>
+            </w:tcMar>
+            <w:vAlign w:val="center"/>
+          </w:tcPr>
+          <w:p>
+            <w:pPr>
+              <w:spacing w:after="0" w:line="240"/>
+              <w:jc w:val="left"/>
+            </w:pPr>
+            <w:r>
+              <w:rPr>
+                <w:rFonts w:ascii="Times New Roman" w:cs="Times New Roman" w:eastAsia="SimSun" w:hAnsi="Times New Roman"/>
+                <w:color w:val="000000"/>
+                <w:sz w:val="21"/>
+                <w:szCs w:val="21"/>
+              </w:rPr>
+              <w:t xml:space="preserve">视觉服务（独立 AI 服务，Node.js 编排调用）</w:t>
             </w:r>
           </w:p>
         </w:tc>
@@ -7030,7 +7276,7 @@
           <w:sz w:val="24"/>
           <w:szCs w:val="24"/>
         </w:rPr>
-        <w:t xml:space="preserve">搭建 Python + YOLOv8 环境，用 PlantDoc 数据集跑通识别 demo</w:t>
+        <w:t xml:space="preserve">采购/整理 ESP32-CAM 与传感器，跑通 M1：传感器采集 → MQTT → Node.js → Vue 控制页</w:t>
       </w:r>
     </w:p>
     <w:p>
@@ -7053,7 +7299,7 @@
           <w:sz w:val="24"/>
           <w:szCs w:val="24"/>
         </w:rPr>
-        <w:t xml:space="preserve">注册 EMQX/OneNET + Dify 账号，跑通 MQTT 收发</w:t>
+        <w:t xml:space="preserve">搭建 Node.js（Express + mqtt.js）+ Vue 3（Vite + ECharts）脚手架与本地 EMQX</w:t>
       </w:r>
     </w:p>
     <w:p>
@@ -7076,7 +7322,7 @@
           <w:sz w:val="24"/>
           <w:szCs w:val="24"/>
         </w:rPr>
-        <w:t xml:space="preserve">整理 SmartAgriculture 现有代码，启动 M1 感知-控制闭环</w:t>
+        <w:t xml:space="preserve">搭建 Python + YOLOv8 环境，用 PlantDoc 数据集跑通识别 demo</w:t>
       </w:r>
     </w:p>
     <w:sectPr>

</xml_diff>